<commit_message>
me faltan todavia esos tres corregir
</commit_message>
<xml_diff>
--- a/Practicos/Notas y Devoluciones 08.docx
+++ b/Practicos/Notas y Devoluciones 08.docx
@@ -35,6 +35,7 @@
           <w:rFonts w:ascii="Segoe UI Emoji" w:hAnsi="Segoe UI Emoji" w:cs="Segoe UI Emoji"/>
         </w:rPr>
       </w:pPr>
+      <w:proofErr w:type="gramStart"/>
       <w:r>
         <w:rPr>
           <w:rFonts w:ascii="Segoe UI Emoji" w:hAnsi="Segoe UI Emoji" w:cs="Segoe UI Emoji"/>
@@ -42,7 +43,11 @@
         <w:t>🎉</w:t>
       </w:r>
       <w:r>
-        <w:t xml:space="preserve">¡Felicitaciones por la entrega del Desafío 08! </w:t>
+        <w:t>¡</w:t>
+      </w:r>
+      <w:proofErr w:type="gramEnd"/>
+      <w:r>
+        <w:t xml:space="preserve">Felicitaciones por la entrega del Desafío 08! </w:t>
       </w:r>
       <w:r>
         <w:rPr>
@@ -67,7 +72,15 @@
       </w:r>
       <w:r>
         <w:tab/>
-        <w:t>la selección de elementos del DOM y la manipulación de su contenido es correcto. También manipulaste correctamente clases y atributos con Dataset.</w:t>
+        <w:t xml:space="preserve">la selección de elementos del DOM y la manipulación de su contenido es correcto. También manipulaste correctamente clases y atributos con </w:t>
+      </w:r>
+      <w:proofErr w:type="spellStart"/>
+      <w:r>
+        <w:t>Dataset</w:t>
+      </w:r>
+      <w:proofErr w:type="spellEnd"/>
+      <w:r>
+        <w:t>.</w:t>
       </w:r>
     </w:p>
     <w:p>
@@ -81,8 +94,37 @@
           <w:u w:val="single"/>
         </w:rPr>
       </w:pPr>
-      <w:r>
-        <w:t>Buenisimo que aplicaste eventos con addEventListener, correcta la aplicación Event Delegation.</w:t>
+      <w:proofErr w:type="spellStart"/>
+      <w:r>
+        <w:t>Buenisimo</w:t>
+      </w:r>
+      <w:proofErr w:type="spellEnd"/>
+      <w:r>
+        <w:t xml:space="preserve"> que aplicaste eventos con </w:t>
+      </w:r>
+      <w:proofErr w:type="spellStart"/>
+      <w:r>
+        <w:t>addEventListener</w:t>
+      </w:r>
+      <w:proofErr w:type="spellEnd"/>
+      <w:r>
+        <w:t xml:space="preserve">, correcta la aplicación </w:t>
+      </w:r>
+      <w:proofErr w:type="spellStart"/>
+      <w:r>
+        <w:t>Event</w:t>
+      </w:r>
+      <w:proofErr w:type="spellEnd"/>
+      <w:r>
+        <w:t xml:space="preserve"> </w:t>
+      </w:r>
+      <w:proofErr w:type="spellStart"/>
+      <w:r>
+        <w:t>Delegation</w:t>
+      </w:r>
+      <w:proofErr w:type="spellEnd"/>
+      <w:r>
+        <w:t>.</w:t>
       </w:r>
     </w:p>
     <w:p/>
@@ -140,6 +182,7 @@
           <w:bCs/>
         </w:rPr>
       </w:pPr>
+      <w:proofErr w:type="spellStart"/>
       <w:r>
         <w:rPr>
           <w:rFonts w:ascii="Segoe UI Emoji" w:hAnsi="Segoe UI Emoji" w:cs="Segoe UI Emoji"/>
@@ -162,24 +205,34 @@
           <w:b/>
           <w:bCs/>
         </w:rPr>
-        <w:t>lez Diego Gaston</w:t>
-      </w:r>
-    </w:p>
-    <w:p>
-      <w:pPr>
-        <w:rPr>
-          <w:rFonts w:ascii="Segoe UI Emoji" w:hAnsi="Segoe UI Emoji" w:cs="Segoe UI Emoji"/>
-          <w:b/>
-          <w:bCs/>
-        </w:rPr>
-      </w:pPr>
-    </w:p>
-    <w:p>
-      <w:pPr>
-        <w:rPr>
-          <w:rFonts w:ascii="Segoe UI Emoji" w:hAnsi="Segoe UI Emoji" w:cs="Segoe UI Emoji"/>
-        </w:rPr>
-      </w:pPr>
+        <w:t>lez</w:t>
+      </w:r>
+      <w:proofErr w:type="spellEnd"/>
+      <w:r>
+        <w:rPr>
+          <w:rFonts w:ascii="Segoe UI Emoji" w:hAnsi="Segoe UI Emoji" w:cs="Segoe UI Emoji"/>
+          <w:b/>
+          <w:bCs/>
+        </w:rPr>
+        <w:t xml:space="preserve"> Diego Gaston</w:t>
+      </w:r>
+    </w:p>
+    <w:p>
+      <w:pPr>
+        <w:rPr>
+          <w:rFonts w:ascii="Segoe UI Emoji" w:hAnsi="Segoe UI Emoji" w:cs="Segoe UI Emoji"/>
+          <w:b/>
+          <w:bCs/>
+        </w:rPr>
+      </w:pPr>
+    </w:p>
+    <w:p>
+      <w:pPr>
+        <w:rPr>
+          <w:rFonts w:ascii="Segoe UI Emoji" w:hAnsi="Segoe UI Emoji" w:cs="Segoe UI Emoji"/>
+        </w:rPr>
+      </w:pPr>
+      <w:proofErr w:type="gramStart"/>
       <w:r>
         <w:rPr>
           <w:rFonts w:ascii="Segoe UI Emoji" w:hAnsi="Segoe UI Emoji" w:cs="Segoe UI Emoji"/>
@@ -187,7 +240,11 @@
         <w:t>🎉</w:t>
       </w:r>
       <w:r>
-        <w:t xml:space="preserve">¡Felicitaciones por la entrega del Desafío 05! </w:t>
+        <w:t>¡</w:t>
+      </w:r>
+      <w:proofErr w:type="gramEnd"/>
+      <w:r>
+        <w:t xml:space="preserve">Felicitaciones por la entrega del Desafío 05! </w:t>
       </w:r>
       <w:r>
         <w:rPr>
@@ -214,10 +271,55 @@
     <w:p/>
     <w:p>
       <w:r>
-        <w:t xml:space="preserve">La declaración y uso de variables let y const esta </w:t>
-      </w:r>
-      <w:r>
-        <w:t>impecable, destaco que supiste cuando utilizar variables const, como pro ejemplo con datos como el “iva” que son valores que no cambian a lo largo del documento.</w:t>
+        <w:t xml:space="preserve">La declaración y uso de variables </w:t>
+      </w:r>
+      <w:proofErr w:type="spellStart"/>
+      <w:r>
+        <w:t>let</w:t>
+      </w:r>
+      <w:proofErr w:type="spellEnd"/>
+      <w:r>
+        <w:t xml:space="preserve"> y </w:t>
+      </w:r>
+      <w:proofErr w:type="spellStart"/>
+      <w:r>
+        <w:t>const</w:t>
+      </w:r>
+      <w:proofErr w:type="spellEnd"/>
+      <w:r>
+        <w:t xml:space="preserve"> esta </w:t>
+      </w:r>
+      <w:r>
+        <w:t xml:space="preserve">impecable, destaco que supiste cuando utilizar variables </w:t>
+      </w:r>
+      <w:proofErr w:type="spellStart"/>
+      <w:r>
+        <w:t>const</w:t>
+      </w:r>
+      <w:proofErr w:type="spellEnd"/>
+      <w:r>
+        <w:t xml:space="preserve">, como </w:t>
+      </w:r>
+      <w:proofErr w:type="spellStart"/>
+      <w:proofErr w:type="gramStart"/>
+      <w:r>
+        <w:t>pro</w:t>
+      </w:r>
+      <w:proofErr w:type="spellEnd"/>
+      <w:r>
+        <w:t xml:space="preserve"> ejemplo</w:t>
+      </w:r>
+      <w:proofErr w:type="gramEnd"/>
+      <w:r>
+        <w:t xml:space="preserve"> con datos como el “</w:t>
+      </w:r>
+      <w:proofErr w:type="spellStart"/>
+      <w:r>
+        <w:t>iva</w:t>
+      </w:r>
+      <w:proofErr w:type="spellEnd"/>
+      <w:r>
+        <w:t>” que son valores que no cambian a lo largo del documento.</w:t>
       </w:r>
     </w:p>
     <w:p/>
@@ -241,7 +343,31 @@
     <w:p/>
     <w:p>
       <w:r>
-        <w:t>Buenísimo que te manejaste con template literals en lugar de concatenar strings.</w:t>
+        <w:t xml:space="preserve">Buenísimo que te manejaste con </w:t>
+      </w:r>
+      <w:proofErr w:type="spellStart"/>
+      <w:r>
+        <w:t>template</w:t>
+      </w:r>
+      <w:proofErr w:type="spellEnd"/>
+      <w:r>
+        <w:t xml:space="preserve"> </w:t>
+      </w:r>
+      <w:proofErr w:type="spellStart"/>
+      <w:r>
+        <w:t>literals</w:t>
+      </w:r>
+      <w:proofErr w:type="spellEnd"/>
+      <w:r>
+        <w:t xml:space="preserve"> en lugar de concatenar </w:t>
+      </w:r>
+      <w:proofErr w:type="spellStart"/>
+      <w:r>
+        <w:t>strings</w:t>
+      </w:r>
+      <w:proofErr w:type="spellEnd"/>
+      <w:r>
+        <w:t>.</w:t>
       </w:r>
     </w:p>
     <w:p/>
@@ -294,24 +420,35 @@
           <w:b/>
           <w:bCs/>
         </w:rPr>
-        <w:t>Albarracin Agustin</w:t>
-      </w:r>
-    </w:p>
-    <w:p>
-      <w:pPr>
-        <w:rPr>
-          <w:rFonts w:ascii="Segoe UI Emoji" w:hAnsi="Segoe UI Emoji" w:cs="Segoe UI Emoji"/>
-          <w:b/>
-          <w:bCs/>
-        </w:rPr>
-      </w:pPr>
-    </w:p>
-    <w:p>
-      <w:pPr>
-        <w:rPr>
-          <w:rFonts w:ascii="Segoe UI Emoji" w:hAnsi="Segoe UI Emoji" w:cs="Segoe UI Emoji"/>
-        </w:rPr>
-      </w:pPr>
+        <w:t xml:space="preserve">Albarracin </w:t>
+      </w:r>
+      <w:proofErr w:type="spellStart"/>
+      <w:r>
+        <w:rPr>
+          <w:rFonts w:ascii="Segoe UI Emoji" w:hAnsi="Segoe UI Emoji" w:cs="Segoe UI Emoji"/>
+          <w:b/>
+          <w:bCs/>
+        </w:rPr>
+        <w:t>Agustin</w:t>
+      </w:r>
+      <w:proofErr w:type="spellEnd"/>
+    </w:p>
+    <w:p>
+      <w:pPr>
+        <w:rPr>
+          <w:rFonts w:ascii="Segoe UI Emoji" w:hAnsi="Segoe UI Emoji" w:cs="Segoe UI Emoji"/>
+          <w:b/>
+          <w:bCs/>
+        </w:rPr>
+      </w:pPr>
+    </w:p>
+    <w:p>
+      <w:pPr>
+        <w:rPr>
+          <w:rFonts w:ascii="Segoe UI Emoji" w:hAnsi="Segoe UI Emoji" w:cs="Segoe UI Emoji"/>
+        </w:rPr>
+      </w:pPr>
+      <w:proofErr w:type="gramStart"/>
       <w:r>
         <w:rPr>
           <w:rFonts w:ascii="Segoe UI Emoji" w:hAnsi="Segoe UI Emoji" w:cs="Segoe UI Emoji"/>
@@ -319,7 +456,11 @@
         <w:t>🎉</w:t>
       </w:r>
       <w:r>
-        <w:t xml:space="preserve">¡Felicitaciones por la entrega del Desafío 08! </w:t>
+        <w:t>¡</w:t>
+      </w:r>
+      <w:proofErr w:type="gramEnd"/>
+      <w:r>
+        <w:t xml:space="preserve">Felicitaciones por la entrega del Desafío 08! </w:t>
       </w:r>
       <w:r>
         <w:rPr>
@@ -330,9 +471,11 @@
     </w:p>
     <w:p/>
     <w:p>
+      <w:proofErr w:type="spellStart"/>
       <w:r>
         <w:t>Agustin</w:t>
       </w:r>
+      <w:proofErr w:type="spellEnd"/>
       <w:r>
         <w:t>, excelente trabajo, te felicito por el compromiso en realizar las entregas.</w:t>
       </w:r>
@@ -344,7 +487,15 @@
       </w:r>
       <w:r>
         <w:tab/>
-        <w:t>la selección de elementos del DOM y la manipulación de su contenido es correcto. También manipulaste correctamente clases y atributos con Dataset.</w:t>
+        <w:t xml:space="preserve">la selección de elementos del DOM y la manipulación de su contenido es correcto. También manipulaste correctamente clases y atributos con </w:t>
+      </w:r>
+      <w:proofErr w:type="spellStart"/>
+      <w:r>
+        <w:t>Dataset</w:t>
+      </w:r>
+      <w:proofErr w:type="spellEnd"/>
+      <w:r>
+        <w:t>.</w:t>
       </w:r>
     </w:p>
     <w:p>
@@ -358,8 +509,37 @@
           <w:u w:val="single"/>
         </w:rPr>
       </w:pPr>
-      <w:r>
-        <w:t>Buenisimo que aplicaste eventos con addEventListener, correcta la aplicación Event Delegation.</w:t>
+      <w:proofErr w:type="spellStart"/>
+      <w:r>
+        <w:t>Buenisimo</w:t>
+      </w:r>
+      <w:proofErr w:type="spellEnd"/>
+      <w:r>
+        <w:t xml:space="preserve"> que aplicaste eventos con </w:t>
+      </w:r>
+      <w:proofErr w:type="spellStart"/>
+      <w:r>
+        <w:t>addEventListener</w:t>
+      </w:r>
+      <w:proofErr w:type="spellEnd"/>
+      <w:r>
+        <w:t xml:space="preserve">, correcta la aplicación </w:t>
+      </w:r>
+      <w:proofErr w:type="spellStart"/>
+      <w:r>
+        <w:t>Event</w:t>
+      </w:r>
+      <w:proofErr w:type="spellEnd"/>
+      <w:r>
+        <w:t xml:space="preserve"> </w:t>
+      </w:r>
+      <w:proofErr w:type="spellStart"/>
+      <w:r>
+        <w:t>Delegation</w:t>
+      </w:r>
+      <w:proofErr w:type="spellEnd"/>
+      <w:r>
+        <w:t>.</w:t>
       </w:r>
     </w:p>
     <w:p/>
@@ -457,6 +637,7 @@
           <w:rFonts w:ascii="Segoe UI Emoji" w:hAnsi="Segoe UI Emoji" w:cs="Segoe UI Emoji"/>
         </w:rPr>
       </w:pPr>
+      <w:proofErr w:type="gramStart"/>
       <w:r>
         <w:rPr>
           <w:rFonts w:ascii="Segoe UI Emoji" w:hAnsi="Segoe UI Emoji" w:cs="Segoe UI Emoji"/>
@@ -464,7 +645,11 @@
         <w:t>🎉</w:t>
       </w:r>
       <w:r>
-        <w:t xml:space="preserve">¡Felicitaciones por la entrega del Desafío 08! </w:t>
+        <w:t>¡</w:t>
+      </w:r>
+      <w:proofErr w:type="gramEnd"/>
+      <w:r>
+        <w:t xml:space="preserve">Felicitaciones por la entrega del Desafío 08! </w:t>
       </w:r>
       <w:r>
         <w:rPr>
@@ -489,7 +674,15 @@
       </w:r>
       <w:r>
         <w:tab/>
-        <w:t>la selección de elementos del DOM y la manipulación de su contenido es correcto. También manipulaste correctamente clases y atributos con Dataset.</w:t>
+        <w:t xml:space="preserve">la selección de elementos del DOM y la manipulación de su contenido es correcto. También manipulaste correctamente clases y atributos con </w:t>
+      </w:r>
+      <w:proofErr w:type="spellStart"/>
+      <w:r>
+        <w:t>Dataset</w:t>
+      </w:r>
+      <w:proofErr w:type="spellEnd"/>
+      <w:r>
+        <w:t>.</w:t>
       </w:r>
     </w:p>
     <w:p>
@@ -503,8 +696,37 @@
           <w:u w:val="single"/>
         </w:rPr>
       </w:pPr>
-      <w:r>
-        <w:t>Buenisimo que aplicaste eventos con addEventListener, correcta la aplicación Event Delegation.</w:t>
+      <w:proofErr w:type="spellStart"/>
+      <w:r>
+        <w:t>Buenisimo</w:t>
+      </w:r>
+      <w:proofErr w:type="spellEnd"/>
+      <w:r>
+        <w:t xml:space="preserve"> que aplicaste eventos con </w:t>
+      </w:r>
+      <w:proofErr w:type="spellStart"/>
+      <w:r>
+        <w:t>addEventListener</w:t>
+      </w:r>
+      <w:proofErr w:type="spellEnd"/>
+      <w:r>
+        <w:t xml:space="preserve">, correcta la aplicación </w:t>
+      </w:r>
+      <w:proofErr w:type="spellStart"/>
+      <w:r>
+        <w:t>Event</w:t>
+      </w:r>
+      <w:proofErr w:type="spellEnd"/>
+      <w:r>
+        <w:t xml:space="preserve"> </w:t>
+      </w:r>
+      <w:proofErr w:type="spellStart"/>
+      <w:r>
+        <w:t>Delegation</w:t>
+      </w:r>
+      <w:proofErr w:type="spellEnd"/>
+      <w:r>
+        <w:t>.</w:t>
       </w:r>
     </w:p>
     <w:p/>
@@ -595,6 +817,7 @@
           <w:rFonts w:ascii="Segoe UI Emoji" w:hAnsi="Segoe UI Emoji" w:cs="Segoe UI Emoji"/>
         </w:rPr>
       </w:pPr>
+      <w:proofErr w:type="gramStart"/>
       <w:r>
         <w:rPr>
           <w:rFonts w:ascii="Segoe UI Emoji" w:hAnsi="Segoe UI Emoji" w:cs="Segoe UI Emoji"/>
@@ -602,7 +825,11 @@
         <w:t>🎉</w:t>
       </w:r>
       <w:r>
-        <w:t xml:space="preserve">¡Felicitaciones por la entrega del Desafío 08! </w:t>
+        <w:t>¡</w:t>
+      </w:r>
+      <w:proofErr w:type="gramEnd"/>
+      <w:r>
+        <w:t xml:space="preserve">Felicitaciones por la entrega del Desafío 08! </w:t>
       </w:r>
       <w:r>
         <w:rPr>
@@ -627,7 +854,15 @@
       </w:r>
       <w:r>
         <w:tab/>
-        <w:t>la selección de elementos del DOM y la manipulación de su contenido es correcto. También manipulaste correctamente clases y atributos con Dataset.</w:t>
+        <w:t xml:space="preserve">la selección de elementos del DOM y la manipulación de su contenido es correcto. También manipulaste correctamente clases y atributos con </w:t>
+      </w:r>
+      <w:proofErr w:type="spellStart"/>
+      <w:r>
+        <w:t>Dataset</w:t>
+      </w:r>
+      <w:proofErr w:type="spellEnd"/>
+      <w:r>
+        <w:t>.</w:t>
       </w:r>
     </w:p>
     <w:p>
@@ -641,8 +876,37 @@
           <w:u w:val="single"/>
         </w:rPr>
       </w:pPr>
-      <w:r>
-        <w:t>Buenisimo que aplicaste eventos con addEventListener, correcta la aplicación Event Delegation.</w:t>
+      <w:proofErr w:type="spellStart"/>
+      <w:r>
+        <w:t>Buenisimo</w:t>
+      </w:r>
+      <w:proofErr w:type="spellEnd"/>
+      <w:r>
+        <w:t xml:space="preserve"> que aplicaste eventos con </w:t>
+      </w:r>
+      <w:proofErr w:type="spellStart"/>
+      <w:r>
+        <w:t>addEventListener</w:t>
+      </w:r>
+      <w:proofErr w:type="spellEnd"/>
+      <w:r>
+        <w:t xml:space="preserve">, correcta la aplicación </w:t>
+      </w:r>
+      <w:proofErr w:type="spellStart"/>
+      <w:r>
+        <w:t>Event</w:t>
+      </w:r>
+      <w:proofErr w:type="spellEnd"/>
+      <w:r>
+        <w:t xml:space="preserve"> </w:t>
+      </w:r>
+      <w:proofErr w:type="spellStart"/>
+      <w:r>
+        <w:t>Delegation</w:t>
+      </w:r>
+      <w:proofErr w:type="spellEnd"/>
+      <w:r>
+        <w:t>.</w:t>
       </w:r>
     </w:p>
     <w:p/>
@@ -677,6 +941,217 @@
         <w:t>10</w:t>
       </w:r>
     </w:p>
+    <w:p>
+      <w:pPr>
+        <w:pBdr>
+          <w:bottom w:val="single" w:sz="6" w:space="0" w:color="auto"/>
+        </w:pBdr>
+      </w:pPr>
+    </w:p>
+    <w:p>
+      <w:pPr>
+        <w:pBdr>
+          <w:bottom w:val="single" w:sz="6" w:space="0" w:color="auto"/>
+        </w:pBdr>
+      </w:pPr>
+    </w:p>
+    <w:p/>
+    <w:p>
+      <w:pPr>
+        <w:rPr>
+          <w:rFonts w:ascii="Segoe UI Emoji" w:hAnsi="Segoe UI Emoji" w:cs="Segoe UI Emoji"/>
+          <w:b/>
+          <w:bCs/>
+          <w:u w:val="single"/>
+        </w:rPr>
+      </w:pPr>
+      <w:r>
+        <w:rPr>
+          <w:rFonts w:ascii="Segoe UI Emoji" w:hAnsi="Segoe UI Emoji" w:cs="Segoe UI Emoji"/>
+          <w:b/>
+          <w:bCs/>
+        </w:rPr>
+        <w:t xml:space="preserve">Segovia </w:t>
+      </w:r>
+      <w:proofErr w:type="spellStart"/>
+      <w:r>
+        <w:rPr>
+          <w:rFonts w:ascii="Segoe UI Emoji" w:hAnsi="Segoe UI Emoji" w:cs="Segoe UI Emoji"/>
+          <w:b/>
+          <w:bCs/>
+        </w:rPr>
+        <w:t>Rodriguez</w:t>
+      </w:r>
+      <w:proofErr w:type="spellEnd"/>
+      <w:r>
+        <w:rPr>
+          <w:rFonts w:ascii="Segoe UI Emoji" w:hAnsi="Segoe UI Emoji" w:cs="Segoe UI Emoji"/>
+          <w:b/>
+          <w:bCs/>
+        </w:rPr>
+        <w:t xml:space="preserve"> </w:t>
+      </w:r>
+      <w:proofErr w:type="spellStart"/>
+      <w:r>
+        <w:rPr>
+          <w:rFonts w:ascii="Segoe UI Emoji" w:hAnsi="Segoe UI Emoji" w:cs="Segoe UI Emoji"/>
+          <w:b/>
+          <w:bCs/>
+        </w:rPr>
+        <w:t>Estefani</w:t>
+      </w:r>
+      <w:proofErr w:type="spellEnd"/>
+      <w:r>
+        <w:rPr>
+          <w:rFonts w:ascii="Segoe UI Emoji" w:hAnsi="Segoe UI Emoji" w:cs="Segoe UI Emoji"/>
+          <w:b/>
+          <w:bCs/>
+        </w:rPr>
+        <w:t xml:space="preserve"> Lujan</w:t>
+      </w:r>
+    </w:p>
+    <w:p>
+      <w:pPr>
+        <w:rPr>
+          <w:rFonts w:ascii="Segoe UI Emoji" w:hAnsi="Segoe UI Emoji" w:cs="Segoe UI Emoji"/>
+          <w:b/>
+          <w:bCs/>
+        </w:rPr>
+      </w:pPr>
+    </w:p>
+    <w:p>
+      <w:pPr>
+        <w:rPr>
+          <w:rFonts w:ascii="Segoe UI Emoji" w:hAnsi="Segoe UI Emoji" w:cs="Segoe UI Emoji"/>
+        </w:rPr>
+      </w:pPr>
+      <w:proofErr w:type="gramStart"/>
+      <w:r>
+        <w:rPr>
+          <w:rFonts w:ascii="Segoe UI Emoji" w:hAnsi="Segoe UI Emoji" w:cs="Segoe UI Emoji"/>
+        </w:rPr>
+        <w:t>🎉</w:t>
+      </w:r>
+      <w:r>
+        <w:t>¡</w:t>
+      </w:r>
+      <w:proofErr w:type="gramEnd"/>
+      <w:r>
+        <w:t xml:space="preserve">Felicitaciones por la entrega del Desafío 07! </w:t>
+      </w:r>
+      <w:r>
+        <w:rPr>
+          <w:rFonts w:ascii="Segoe UI Emoji" w:hAnsi="Segoe UI Emoji" w:cs="Segoe UI Emoji"/>
+        </w:rPr>
+        <w:t>🎉</w:t>
+      </w:r>
+    </w:p>
+    <w:p/>
+    <w:p>
+      <w:proofErr w:type="spellStart"/>
+      <w:r>
+        <w:t>Estefani</w:t>
+      </w:r>
+      <w:proofErr w:type="spellEnd"/>
+      <w:r>
+        <w:t>, excelente trabajo, te felicito por el compromiso en realizar las entregas.</w:t>
+      </w:r>
+    </w:p>
+    <w:p/>
+    <w:p>
+      <w:r>
+        <w:t xml:space="preserve">Excelente la implementación de métodos para recorrer para </w:t>
+      </w:r>
+      <w:proofErr w:type="spellStart"/>
+      <w:r>
+        <w:t>arrays</w:t>
+      </w:r>
+      <w:proofErr w:type="spellEnd"/>
+      <w:r>
+        <w:t xml:space="preserve"> y objetos, diferenciaste correctamente los métodos </w:t>
+      </w:r>
+      <w:proofErr w:type="spellStart"/>
+      <w:r>
+        <w:t>splice</w:t>
+      </w:r>
+      <w:proofErr w:type="spellEnd"/>
+      <w:r>
+        <w:t xml:space="preserve"> y </w:t>
+      </w:r>
+      <w:proofErr w:type="spellStart"/>
+      <w:r>
+        <w:t>slice</w:t>
+      </w:r>
+      <w:proofErr w:type="spellEnd"/>
+      <w:r>
+        <w:t xml:space="preserve">. </w:t>
+      </w:r>
+    </w:p>
+    <w:p/>
+    <w:p>
+      <w:r>
+        <w:lastRenderedPageBreak/>
+        <w:t>Para evitar la repetición de código te manejaste correctamente con funciones con retorno y también de alto orden.</w:t>
+      </w:r>
+    </w:p>
+    <w:p/>
+    <w:p>
+      <w:r>
+        <w:t xml:space="preserve">Buenísimo que te manejaste con </w:t>
+      </w:r>
+      <w:proofErr w:type="spellStart"/>
+      <w:r>
+        <w:t>template</w:t>
+      </w:r>
+      <w:proofErr w:type="spellEnd"/>
+      <w:r>
+        <w:t xml:space="preserve"> </w:t>
+      </w:r>
+      <w:proofErr w:type="spellStart"/>
+      <w:r>
+        <w:t>literals</w:t>
+      </w:r>
+      <w:proofErr w:type="spellEnd"/>
+      <w:r>
+        <w:t xml:space="preserve"> en lugar de concatenar </w:t>
+      </w:r>
+      <w:proofErr w:type="spellStart"/>
+      <w:r>
+        <w:t>strings</w:t>
+      </w:r>
+      <w:proofErr w:type="spellEnd"/>
+      <w:r>
+        <w:t xml:space="preserve"> y que utilizaste condicionales ternarios.</w:t>
+      </w:r>
+    </w:p>
+    <w:p/>
+    <w:p>
+      <w:r>
+        <w:t>Quiero destacar la prolijidad de tu código.</w:t>
+      </w:r>
+    </w:p>
+    <w:p/>
+    <w:p/>
+    <w:p>
+      <w:r>
+        <w:t>Muy buen trabajo ¡</w:t>
+      </w:r>
+    </w:p>
+    <w:p/>
+    <w:p>
+      <w:r>
+        <w:t xml:space="preserve">Tu nota en el Desafío 07 es: </w:t>
+      </w:r>
+      <w:r>
+        <w:rPr>
+          <w:b/>
+          <w:bCs/>
+        </w:rPr>
+        <w:t>10</w:t>
+      </w:r>
+    </w:p>
+    <w:p/>
+    <w:p/>
     <w:p>
       <w:pPr>
         <w:pBdr>
@@ -684,6 +1159,165 @@
         </w:pBdr>
       </w:pPr>
     </w:p>
+    <w:p/>
+    <w:p/>
+    <w:p>
+      <w:pPr>
+        <w:rPr>
+          <w:rFonts w:ascii="Segoe UI Emoji" w:hAnsi="Segoe UI Emoji" w:cs="Segoe UI Emoji"/>
+          <w:b/>
+          <w:bCs/>
+        </w:rPr>
+      </w:pPr>
+      <w:r>
+        <w:rPr>
+          <w:rFonts w:ascii="Segoe UI Emoji" w:hAnsi="Segoe UI Emoji" w:cs="Segoe UI Emoji"/>
+          <w:b/>
+          <w:bCs/>
+        </w:rPr>
+        <w:t>Ulate Carlos</w:t>
+      </w:r>
+    </w:p>
+    <w:p>
+      <w:pPr>
+        <w:rPr>
+          <w:rFonts w:ascii="Segoe UI Emoji" w:hAnsi="Segoe UI Emoji" w:cs="Segoe UI Emoji"/>
+          <w:b/>
+          <w:bCs/>
+        </w:rPr>
+      </w:pPr>
+    </w:p>
+    <w:p>
+      <w:pPr>
+        <w:rPr>
+          <w:rFonts w:ascii="Segoe UI Emoji" w:hAnsi="Segoe UI Emoji" w:cs="Segoe UI Emoji"/>
+        </w:rPr>
+      </w:pPr>
+      <w:proofErr w:type="gramStart"/>
+      <w:r>
+        <w:rPr>
+          <w:rFonts w:ascii="Segoe UI Emoji" w:hAnsi="Segoe UI Emoji" w:cs="Segoe UI Emoji"/>
+        </w:rPr>
+        <w:t>🎉</w:t>
+      </w:r>
+      <w:r>
+        <w:t>¡</w:t>
+      </w:r>
+      <w:proofErr w:type="gramEnd"/>
+      <w:r>
+        <w:t xml:space="preserve">Felicitaciones por la entrega del Desafío 08! </w:t>
+      </w:r>
+      <w:r>
+        <w:rPr>
+          <w:rFonts w:ascii="Segoe UI Emoji" w:hAnsi="Segoe UI Emoji" w:cs="Segoe UI Emoji"/>
+        </w:rPr>
+        <w:t>🎉</w:t>
+      </w:r>
+    </w:p>
+    <w:p/>
+    <w:p>
+      <w:r>
+        <w:t>Carlos</w:t>
+      </w:r>
+      <w:r>
+        <w:t>, excelente trabajo, te felicito por el compromiso en realizar las entregas.</w:t>
+      </w:r>
+    </w:p>
+    <w:p/>
+    <w:p>
+      <w:r>
+        <w:t xml:space="preserve">Excelente el resultado logrado, </w:t>
+      </w:r>
+      <w:r>
+        <w:tab/>
+        <w:t xml:space="preserve">la selección de elementos del DOM y la manipulación de su contenido es correcto. También manipulaste correctamente clases y atributos con </w:t>
+      </w:r>
+      <w:proofErr w:type="spellStart"/>
+      <w:r>
+        <w:t>Dataset</w:t>
+      </w:r>
+      <w:proofErr w:type="spellEnd"/>
+      <w:r>
+        <w:t>.</w:t>
+      </w:r>
+    </w:p>
+    <w:p>
+      <w:r>
+        <w:t xml:space="preserve"> </w:t>
+      </w:r>
+    </w:p>
+    <w:p>
+      <w:pPr>
+        <w:rPr>
+          <w:u w:val="single"/>
+        </w:rPr>
+      </w:pPr>
+      <w:proofErr w:type="spellStart"/>
+      <w:r>
+        <w:t>Buenisimo</w:t>
+      </w:r>
+      <w:proofErr w:type="spellEnd"/>
+      <w:r>
+        <w:t xml:space="preserve"> que aplicaste eventos con </w:t>
+      </w:r>
+      <w:proofErr w:type="spellStart"/>
+      <w:r>
+        <w:t>addEventListener</w:t>
+      </w:r>
+      <w:proofErr w:type="spellEnd"/>
+      <w:r>
+        <w:t xml:space="preserve">, correcta la aplicación </w:t>
+      </w:r>
+      <w:proofErr w:type="spellStart"/>
+      <w:r>
+        <w:t>Event</w:t>
+      </w:r>
+      <w:proofErr w:type="spellEnd"/>
+      <w:r>
+        <w:t xml:space="preserve"> </w:t>
+      </w:r>
+      <w:proofErr w:type="spellStart"/>
+      <w:r>
+        <w:t>Delegation</w:t>
+      </w:r>
+      <w:proofErr w:type="spellEnd"/>
+      <w:r>
+        <w:t>.</w:t>
+      </w:r>
+    </w:p>
+    <w:p/>
+    <w:p>
+      <w:r>
+        <w:t>Destaco que para evitar la repetición de código te manejaste correctamente con funciones con retorno y también de alto orden.</w:t>
+      </w:r>
+    </w:p>
+    <w:p/>
+    <w:p>
+      <w:r>
+        <w:t>Quiero destacar la prolijidad de tu código.</w:t>
+      </w:r>
+    </w:p>
+    <w:p/>
+    <w:p/>
+    <w:p>
+      <w:r>
+        <w:t>Excelente trabajo ¡</w:t>
+      </w:r>
+    </w:p>
+    <w:p/>
+    <w:p>
+      <w:r>
+        <w:t xml:space="preserve">Tu nota en el Desafío 08 es: </w:t>
+      </w:r>
+      <w:r>
+        <w:rPr>
+          <w:b/>
+          <w:bCs/>
+        </w:rPr>
+        <w:t>10</w:t>
+      </w:r>
+    </w:p>
+    <w:p/>
     <w:p>
       <w:pPr>
         <w:pBdr>
@@ -698,72 +1332,138 @@
           <w:rFonts w:ascii="Segoe UI Emoji" w:hAnsi="Segoe UI Emoji" w:cs="Segoe UI Emoji"/>
           <w:b/>
           <w:bCs/>
+        </w:rPr>
+      </w:pPr>
+      <w:proofErr w:type="spellStart"/>
+      <w:r>
+        <w:rPr>
+          <w:rFonts w:ascii="Segoe UI Emoji" w:hAnsi="Segoe UI Emoji" w:cs="Segoe UI Emoji"/>
+          <w:b/>
+          <w:bCs/>
+        </w:rPr>
+        <w:t>Chiapello</w:t>
+      </w:r>
+      <w:proofErr w:type="spellEnd"/>
+      <w:r>
+        <w:rPr>
+          <w:rFonts w:ascii="Segoe UI Emoji" w:hAnsi="Segoe UI Emoji" w:cs="Segoe UI Emoji"/>
+          <w:b/>
+          <w:bCs/>
+        </w:rPr>
+        <w:t xml:space="preserve"> Gianluca</w:t>
+      </w:r>
+    </w:p>
+    <w:p>
+      <w:pPr>
+        <w:rPr>
+          <w:rFonts w:ascii="Segoe UI Emoji" w:hAnsi="Segoe UI Emoji" w:cs="Segoe UI Emoji"/>
+          <w:b/>
+          <w:bCs/>
+        </w:rPr>
+      </w:pPr>
+    </w:p>
+    <w:p>
+      <w:pPr>
+        <w:rPr>
+          <w:rFonts w:ascii="Segoe UI Emoji" w:hAnsi="Segoe UI Emoji" w:cs="Segoe UI Emoji"/>
+        </w:rPr>
+      </w:pPr>
+      <w:proofErr w:type="gramStart"/>
+      <w:r>
+        <w:rPr>
+          <w:rFonts w:ascii="Segoe UI Emoji" w:hAnsi="Segoe UI Emoji" w:cs="Segoe UI Emoji"/>
+        </w:rPr>
+        <w:t>🎉</w:t>
+      </w:r>
+      <w:r>
+        <w:t>¡</w:t>
+      </w:r>
+      <w:proofErr w:type="gramEnd"/>
+      <w:r>
+        <w:t xml:space="preserve">Felicitaciones por la entrega del Desafío 08! </w:t>
+      </w:r>
+      <w:r>
+        <w:rPr>
+          <w:rFonts w:ascii="Segoe UI Emoji" w:hAnsi="Segoe UI Emoji" w:cs="Segoe UI Emoji"/>
+        </w:rPr>
+        <w:t>🎉</w:t>
+      </w:r>
+    </w:p>
+    <w:p/>
+    <w:p>
+      <w:r>
+        <w:t>Gianluca</w:t>
+      </w:r>
+      <w:r>
+        <w:t>, excelente trabajo, te felicito por el compromiso en realizar las entregas.</w:t>
+      </w:r>
+    </w:p>
+    <w:p/>
+    <w:p>
+      <w:r>
+        <w:t xml:space="preserve">Excelente el resultado logrado, </w:t>
+      </w:r>
+      <w:r>
+        <w:tab/>
+        <w:t xml:space="preserve">la selección de elementos del DOM y la manipulación de su contenido es correcto. También manipulaste correctamente clases y atributos con </w:t>
+      </w:r>
+      <w:proofErr w:type="spellStart"/>
+      <w:r>
+        <w:t>Dataset</w:t>
+      </w:r>
+      <w:proofErr w:type="spellEnd"/>
+      <w:r>
+        <w:t>.</w:t>
+      </w:r>
+    </w:p>
+    <w:p>
+      <w:r>
+        <w:t xml:space="preserve"> </w:t>
+      </w:r>
+    </w:p>
+    <w:p>
+      <w:pPr>
+        <w:rPr>
           <w:u w:val="single"/>
         </w:rPr>
       </w:pPr>
-      <w:r>
-        <w:rPr>
-          <w:rFonts w:ascii="Segoe UI Emoji" w:hAnsi="Segoe UI Emoji" w:cs="Segoe UI Emoji"/>
-          <w:b/>
-          <w:bCs/>
-        </w:rPr>
-        <w:t>Segovia Rodriguez Estefani Lujan</w:t>
-      </w:r>
-    </w:p>
-    <w:p>
-      <w:pPr>
-        <w:rPr>
-          <w:rFonts w:ascii="Segoe UI Emoji" w:hAnsi="Segoe UI Emoji" w:cs="Segoe UI Emoji"/>
-          <w:b/>
-          <w:bCs/>
-        </w:rPr>
-      </w:pPr>
-    </w:p>
-    <w:p>
-      <w:pPr>
-        <w:rPr>
-          <w:rFonts w:ascii="Segoe UI Emoji" w:hAnsi="Segoe UI Emoji" w:cs="Segoe UI Emoji"/>
-        </w:rPr>
-      </w:pPr>
-      <w:r>
-        <w:rPr>
-          <w:rFonts w:ascii="Segoe UI Emoji" w:hAnsi="Segoe UI Emoji" w:cs="Segoe UI Emoji"/>
-        </w:rPr>
-        <w:t>🎉</w:t>
-      </w:r>
-      <w:r>
-        <w:t xml:space="preserve">¡Felicitaciones por la entrega del Desafío 07! </w:t>
-      </w:r>
-      <w:r>
-        <w:rPr>
-          <w:rFonts w:ascii="Segoe UI Emoji" w:hAnsi="Segoe UI Emoji" w:cs="Segoe UI Emoji"/>
-        </w:rPr>
-        <w:t>🎉</w:t>
-      </w:r>
-    </w:p>
-    <w:p/>
-    <w:p>
-      <w:r>
-        <w:t>Estefani, excelente trabajo, te felicito por el compromiso en realizar las entregas.</w:t>
-      </w:r>
-    </w:p>
-    <w:p/>
-    <w:p>
-      <w:r>
-        <w:t xml:space="preserve">Excelente la implementación de métodos para recorrer para arrays y objetos, diferenciaste correctamente los métodos splice y slice. </w:t>
-      </w:r>
-    </w:p>
-    <w:p/>
-    <w:p>
-      <w:r>
-        <w:lastRenderedPageBreak/>
-        <w:t>Para evitar la repetición de código te manejaste correctamente con funciones con retorno y también de alto orden.</w:t>
-      </w:r>
-    </w:p>
-    <w:p/>
-    <w:p>
-      <w:r>
-        <w:t>Buenísimo que te manejaste con template literals en lugar de concatenar strings y que utilizaste condicionales ternarios.</w:t>
+      <w:proofErr w:type="spellStart"/>
+      <w:r>
+        <w:t>Buenisimo</w:t>
+      </w:r>
+      <w:proofErr w:type="spellEnd"/>
+      <w:r>
+        <w:t xml:space="preserve"> que aplicaste eventos con </w:t>
+      </w:r>
+      <w:proofErr w:type="spellStart"/>
+      <w:r>
+        <w:t>addEventListener</w:t>
+      </w:r>
+      <w:proofErr w:type="spellEnd"/>
+      <w:r>
+        <w:t xml:space="preserve">, correcta la aplicación </w:t>
+      </w:r>
+      <w:proofErr w:type="spellStart"/>
+      <w:r>
+        <w:t>Event</w:t>
+      </w:r>
+      <w:proofErr w:type="spellEnd"/>
+      <w:r>
+        <w:t xml:space="preserve"> </w:t>
+      </w:r>
+      <w:proofErr w:type="spellStart"/>
+      <w:r>
+        <w:t>Delegation</w:t>
+      </w:r>
+      <w:proofErr w:type="spellEnd"/>
+      <w:r>
+        <w:t>.</w:t>
+      </w:r>
+    </w:p>
+    <w:p/>
+    <w:p>
+      <w:r>
+        <w:t>Destaco que para evitar la repetición de código te manejaste correctamente con funciones con retorno y también de alto orden.</w:t>
       </w:r>
     </w:p>
     <w:p/>
@@ -776,13 +1476,13 @@
     <w:p/>
     <w:p>
       <w:r>
-        <w:t>Muy buen trabajo ¡</w:t>
-      </w:r>
-    </w:p>
-    <w:p/>
-    <w:p>
-      <w:r>
-        <w:t xml:space="preserve">Tu nota en el Desafío 07 es: </w:t>
+        <w:t>Excelente trabajo ¡</w:t>
+      </w:r>
+    </w:p>
+    <w:p/>
+    <w:p>
+      <w:r>
+        <w:t xml:space="preserve">Tu nota en el Desafío 08 es: </w:t>
       </w:r>
       <w:r>
         <w:rPr>
@@ -792,7 +1492,6 @@
         <w:t>10</w:t>
       </w:r>
     </w:p>
-    <w:p/>
     <w:p/>
     <w:p>
       <w:pPr>
@@ -805,121 +1504,6 @@
     <w:p/>
     <w:p>
       <w:pPr>
-        <w:rPr>
-          <w:rFonts w:ascii="Segoe UI Emoji" w:hAnsi="Segoe UI Emoji" w:cs="Segoe UI Emoji"/>
-          <w:b/>
-          <w:bCs/>
-        </w:rPr>
-      </w:pPr>
-      <w:r>
-        <w:rPr>
-          <w:rFonts w:ascii="Segoe UI Emoji" w:hAnsi="Segoe UI Emoji" w:cs="Segoe UI Emoji"/>
-          <w:b/>
-          <w:bCs/>
-        </w:rPr>
-        <w:t>Ulate Carlos</w:t>
-      </w:r>
-    </w:p>
-    <w:p>
-      <w:pPr>
-        <w:rPr>
-          <w:rFonts w:ascii="Segoe UI Emoji" w:hAnsi="Segoe UI Emoji" w:cs="Segoe UI Emoji"/>
-          <w:b/>
-          <w:bCs/>
-        </w:rPr>
-      </w:pPr>
-    </w:p>
-    <w:p>
-      <w:pPr>
-        <w:rPr>
-          <w:rFonts w:ascii="Segoe UI Emoji" w:hAnsi="Segoe UI Emoji" w:cs="Segoe UI Emoji"/>
-        </w:rPr>
-      </w:pPr>
-      <w:r>
-        <w:rPr>
-          <w:rFonts w:ascii="Segoe UI Emoji" w:hAnsi="Segoe UI Emoji" w:cs="Segoe UI Emoji"/>
-        </w:rPr>
-        <w:t>🎉</w:t>
-      </w:r>
-      <w:r>
-        <w:t xml:space="preserve">¡Felicitaciones por la entrega del Desafío 08! </w:t>
-      </w:r>
-      <w:r>
-        <w:rPr>
-          <w:rFonts w:ascii="Segoe UI Emoji" w:hAnsi="Segoe UI Emoji" w:cs="Segoe UI Emoji"/>
-        </w:rPr>
-        <w:t>🎉</w:t>
-      </w:r>
-    </w:p>
-    <w:p/>
-    <w:p>
-      <w:r>
-        <w:t>Carlos</w:t>
-      </w:r>
-      <w:r>
-        <w:t>, excelente trabajo, te felicito por el compromiso en realizar las entregas.</w:t>
-      </w:r>
-    </w:p>
-    <w:p/>
-    <w:p>
-      <w:r>
-        <w:t xml:space="preserve">Excelente el resultado logrado, </w:t>
-      </w:r>
-      <w:r>
-        <w:tab/>
-        <w:t>la selección de elementos del DOM y la manipulación de su contenido es correcto. También manipulaste correctamente clases y atributos con Dataset.</w:t>
-      </w:r>
-    </w:p>
-    <w:p>
-      <w:r>
-        <w:t xml:space="preserve"> </w:t>
-      </w:r>
-    </w:p>
-    <w:p>
-      <w:pPr>
-        <w:rPr>
-          <w:u w:val="single"/>
-        </w:rPr>
-      </w:pPr>
-      <w:r>
-        <w:t>Buenisimo que aplicaste eventos con addEventListener, correcta la aplicación Event Delegation.</w:t>
-      </w:r>
-    </w:p>
-    <w:p/>
-    <w:p>
-      <w:r>
-        <w:t>Destaco que para evitar la repetición de código te manejaste correctamente con funciones con retorno y también de alto orden.</w:t>
-      </w:r>
-    </w:p>
-    <w:p/>
-    <w:p>
-      <w:r>
-        <w:t>Quiero destacar la prolijidad de tu código.</w:t>
-      </w:r>
-    </w:p>
-    <w:p/>
-    <w:p/>
-    <w:p>
-      <w:r>
-        <w:t>Excelente trabajo ¡</w:t>
-      </w:r>
-    </w:p>
-    <w:p/>
-    <w:p>
-      <w:r>
-        <w:t xml:space="preserve">Tu nota en el Desafío 08 es: </w:t>
-      </w:r>
-      <w:r>
-        <w:rPr>
-          <w:b/>
-          <w:bCs/>
-        </w:rPr>
-        <w:t>10</w:t>
-      </w:r>
-    </w:p>
-    <w:p/>
-    <w:p>
-      <w:pPr>
         <w:pBdr>
           <w:bottom w:val="single" w:sz="6" w:space="1" w:color="auto"/>
         </w:pBdr>
@@ -940,24 +1524,25 @@
           <w:b/>
           <w:bCs/>
         </w:rPr>
-        <w:t>Chiapello Gianluca</w:t>
-      </w:r>
-    </w:p>
-    <w:p>
-      <w:pPr>
-        <w:rPr>
-          <w:rFonts w:ascii="Segoe UI Emoji" w:hAnsi="Segoe UI Emoji" w:cs="Segoe UI Emoji"/>
-          <w:b/>
-          <w:bCs/>
-        </w:rPr>
-      </w:pPr>
-    </w:p>
-    <w:p>
-      <w:pPr>
-        <w:rPr>
-          <w:rFonts w:ascii="Segoe UI Emoji" w:hAnsi="Segoe UI Emoji" w:cs="Segoe UI Emoji"/>
-        </w:rPr>
-      </w:pPr>
+        <w:t>Capone Santino</w:t>
+      </w:r>
+    </w:p>
+    <w:p>
+      <w:pPr>
+        <w:rPr>
+          <w:rFonts w:ascii="Segoe UI Emoji" w:hAnsi="Segoe UI Emoji" w:cs="Segoe UI Emoji"/>
+          <w:b/>
+          <w:bCs/>
+        </w:rPr>
+      </w:pPr>
+    </w:p>
+    <w:p>
+      <w:pPr>
+        <w:rPr>
+          <w:rFonts w:ascii="Segoe UI Emoji" w:hAnsi="Segoe UI Emoji" w:cs="Segoe UI Emoji"/>
+        </w:rPr>
+      </w:pPr>
+      <w:proofErr w:type="gramStart"/>
       <w:r>
         <w:rPr>
           <w:rFonts w:ascii="Segoe UI Emoji" w:hAnsi="Segoe UI Emoji" w:cs="Segoe UI Emoji"/>
@@ -965,7 +1550,11 @@
         <w:t>🎉</w:t>
       </w:r>
       <w:r>
-        <w:t xml:space="preserve">¡Felicitaciones por la entrega del Desafío 08! </w:t>
+        <w:t>¡</w:t>
+      </w:r>
+      <w:proofErr w:type="gramEnd"/>
+      <w:r>
+        <w:t xml:space="preserve">Felicitaciones por la entrega del Desafío 08! </w:t>
       </w:r>
       <w:r>
         <w:rPr>
@@ -977,7 +1566,7 @@
     <w:p/>
     <w:p>
       <w:r>
-        <w:t>Gianluca</w:t>
+        <w:t>Santino</w:t>
       </w:r>
       <w:r>
         <w:t>, excelente trabajo, te felicito por el compromiso en realizar las entregas.</w:t>
@@ -990,7 +1579,15 @@
       </w:r>
       <w:r>
         <w:tab/>
-        <w:t>la selección de elementos del DOM y la manipulación de su contenido es correcto. También manipulaste correctamente clases y atributos con Dataset.</w:t>
+        <w:t xml:space="preserve">la selección de elementos del DOM y la manipulación de su contenido es correcto. También manipulaste correctamente clases y atributos con </w:t>
+      </w:r>
+      <w:proofErr w:type="spellStart"/>
+      <w:r>
+        <w:t>Dataset</w:t>
+      </w:r>
+      <w:proofErr w:type="spellEnd"/>
+      <w:r>
+        <w:t>.</w:t>
       </w:r>
     </w:p>
     <w:p>
@@ -1004,8 +1601,37 @@
           <w:u w:val="single"/>
         </w:rPr>
       </w:pPr>
-      <w:r>
-        <w:t>Buenisimo que aplicaste eventos con addEventListener, correcta la aplicación Event Delegation.</w:t>
+      <w:proofErr w:type="spellStart"/>
+      <w:r>
+        <w:t>Buenisimo</w:t>
+      </w:r>
+      <w:proofErr w:type="spellEnd"/>
+      <w:r>
+        <w:t xml:space="preserve"> que aplicaste eventos con </w:t>
+      </w:r>
+      <w:proofErr w:type="spellStart"/>
+      <w:r>
+        <w:t>addEventListener</w:t>
+      </w:r>
+      <w:proofErr w:type="spellEnd"/>
+      <w:r>
+        <w:t xml:space="preserve">, correcta la aplicación </w:t>
+      </w:r>
+      <w:proofErr w:type="spellStart"/>
+      <w:r>
+        <w:t>Event</w:t>
+      </w:r>
+      <w:proofErr w:type="spellEnd"/>
+      <w:r>
+        <w:t xml:space="preserve"> </w:t>
+      </w:r>
+      <w:proofErr w:type="spellStart"/>
+      <w:r>
+        <w:t>Delegation</w:t>
+      </w:r>
+      <w:proofErr w:type="spellEnd"/>
+      <w:r>
+        <w:t>.</w:t>
       </w:r>
     </w:p>
     <w:p/>
@@ -1049,47 +1675,39 @@
       </w:pPr>
     </w:p>
     <w:p/>
-    <w:p/>
-    <w:p>
-      <w:pPr>
-        <w:pBdr>
-          <w:bottom w:val="single" w:sz="6" w:space="1" w:color="auto"/>
-        </w:pBdr>
-      </w:pPr>
-    </w:p>
-    <w:p/>
-    <w:p>
-      <w:pPr>
-        <w:rPr>
-          <w:rFonts w:ascii="Segoe UI Emoji" w:hAnsi="Segoe UI Emoji" w:cs="Segoe UI Emoji"/>
-          <w:b/>
-          <w:bCs/>
-        </w:rPr>
-      </w:pPr>
-      <w:r>
-        <w:rPr>
-          <w:rFonts w:ascii="Segoe UI Emoji" w:hAnsi="Segoe UI Emoji" w:cs="Segoe UI Emoji"/>
-          <w:b/>
-          <w:bCs/>
-        </w:rPr>
-        <w:t>Capone Santino</w:t>
-      </w:r>
-    </w:p>
-    <w:p>
-      <w:pPr>
-        <w:rPr>
-          <w:rFonts w:ascii="Segoe UI Emoji" w:hAnsi="Segoe UI Emoji" w:cs="Segoe UI Emoji"/>
-          <w:b/>
-          <w:bCs/>
-        </w:rPr>
-      </w:pPr>
-    </w:p>
-    <w:p>
-      <w:pPr>
-        <w:rPr>
-          <w:rFonts w:ascii="Segoe UI Emoji" w:hAnsi="Segoe UI Emoji" w:cs="Segoe UI Emoji"/>
-        </w:rPr>
-      </w:pPr>
+    <w:p>
+      <w:pPr>
+        <w:rPr>
+          <w:rFonts w:ascii="Segoe UI Emoji" w:hAnsi="Segoe UI Emoji" w:cs="Segoe UI Emoji"/>
+          <w:b/>
+          <w:bCs/>
+        </w:rPr>
+      </w:pPr>
+      <w:r>
+        <w:rPr>
+          <w:rFonts w:ascii="Segoe UI Emoji" w:hAnsi="Segoe UI Emoji" w:cs="Segoe UI Emoji"/>
+          <w:b/>
+          <w:bCs/>
+        </w:rPr>
+        <w:t>Vernengo Hipolito</w:t>
+      </w:r>
+    </w:p>
+    <w:p>
+      <w:pPr>
+        <w:rPr>
+          <w:rFonts w:ascii="Segoe UI Emoji" w:hAnsi="Segoe UI Emoji" w:cs="Segoe UI Emoji"/>
+          <w:b/>
+          <w:bCs/>
+        </w:rPr>
+      </w:pPr>
+    </w:p>
+    <w:p>
+      <w:pPr>
+        <w:rPr>
+          <w:rFonts w:ascii="Segoe UI Emoji" w:hAnsi="Segoe UI Emoji" w:cs="Segoe UI Emoji"/>
+        </w:rPr>
+      </w:pPr>
+      <w:proofErr w:type="gramStart"/>
       <w:r>
         <w:rPr>
           <w:rFonts w:ascii="Segoe UI Emoji" w:hAnsi="Segoe UI Emoji" w:cs="Segoe UI Emoji"/>
@@ -1097,7 +1715,11 @@
         <w:t>🎉</w:t>
       </w:r>
       <w:r>
-        <w:t xml:space="preserve">¡Felicitaciones por la entrega del Desafío 08! </w:t>
+        <w:t>¡</w:t>
+      </w:r>
+      <w:proofErr w:type="gramEnd"/>
+      <w:r>
+        <w:t xml:space="preserve">Felicitaciones por la entrega del Desafío 07! </w:t>
       </w:r>
       <w:r>
         <w:rPr>
@@ -1109,7 +1731,7 @@
     <w:p/>
     <w:p>
       <w:r>
-        <w:t>Santino</w:t>
+        <w:t>Hipolito</w:t>
       </w:r>
       <w:r>
         <w:t>, excelente trabajo, te felicito por el compromiso en realizar las entregas.</w:t>
@@ -1118,142 +1740,67 @@
     <w:p/>
     <w:p>
       <w:r>
-        <w:t xml:space="preserve">Excelente el resultado logrado, </w:t>
-      </w:r>
-      <w:r>
-        <w:tab/>
-        <w:t>la selección de elementos del DOM y la manipulación de su contenido es correcto. También manipulaste correctamente clases y atributos con Dataset.</w:t>
-      </w:r>
-    </w:p>
-    <w:p>
+        <w:t xml:space="preserve">Excelente la implementación de métodos para recorrer para </w:t>
+      </w:r>
+      <w:proofErr w:type="spellStart"/>
+      <w:r>
+        <w:t>arrays</w:t>
+      </w:r>
+      <w:proofErr w:type="spellEnd"/>
+      <w:r>
+        <w:t xml:space="preserve"> y objetos, diferenciaste correctamente los métodos </w:t>
+      </w:r>
+      <w:proofErr w:type="spellStart"/>
+      <w:r>
+        <w:t>splice</w:t>
+      </w:r>
+      <w:proofErr w:type="spellEnd"/>
+      <w:r>
+        <w:t xml:space="preserve"> y </w:t>
+      </w:r>
+      <w:proofErr w:type="spellStart"/>
+      <w:r>
+        <w:t>slice</w:t>
+      </w:r>
+      <w:proofErr w:type="spellEnd"/>
+      <w:r>
+        <w:t xml:space="preserve">. </w:t>
+      </w:r>
+    </w:p>
+    <w:p/>
+    <w:p>
+      <w:r>
+        <w:t>Para evitar la repetición de código te manejaste correctamente con funciones con retorno y también de alto orden.</w:t>
+      </w:r>
+    </w:p>
+    <w:p/>
+    <w:p>
+      <w:r>
+        <w:t xml:space="preserve">Buenísimo que te manejaste con </w:t>
+      </w:r>
+      <w:proofErr w:type="spellStart"/>
+      <w:r>
+        <w:t>template</w:t>
+      </w:r>
+      <w:proofErr w:type="spellEnd"/>
       <w:r>
         <w:t xml:space="preserve"> </w:t>
       </w:r>
-    </w:p>
-    <w:p>
-      <w:pPr>
-        <w:rPr>
-          <w:u w:val="single"/>
-        </w:rPr>
-      </w:pPr>
-      <w:r>
-        <w:t>Buenisimo que aplicaste eventos con addEventListener, correcta la aplicación Event Delegation.</w:t>
-      </w:r>
-    </w:p>
-    <w:p/>
-    <w:p>
-      <w:r>
-        <w:t>Destaco que para evitar la repetición de código te manejaste correctamente con funciones con retorno y también de alto orden.</w:t>
-      </w:r>
-    </w:p>
-    <w:p/>
-    <w:p>
-      <w:r>
-        <w:t>Quiero destacar la prolijidad de tu código.</w:t>
-      </w:r>
-    </w:p>
-    <w:p/>
-    <w:p/>
-    <w:p>
-      <w:r>
-        <w:t>Excelente trabajo ¡</w:t>
-      </w:r>
-    </w:p>
-    <w:p/>
-    <w:p>
-      <w:r>
-        <w:t xml:space="preserve">Tu nota en el Desafío 08 es: </w:t>
-      </w:r>
-      <w:r>
-        <w:rPr>
-          <w:b/>
-          <w:bCs/>
-        </w:rPr>
-        <w:t>10</w:t>
-      </w:r>
-    </w:p>
-    <w:p/>
-    <w:p>
-      <w:pPr>
-        <w:pBdr>
-          <w:bottom w:val="single" w:sz="6" w:space="1" w:color="auto"/>
-        </w:pBdr>
-      </w:pPr>
-    </w:p>
-    <w:p/>
-    <w:p>
-      <w:pPr>
-        <w:rPr>
-          <w:rFonts w:ascii="Segoe UI Emoji" w:hAnsi="Segoe UI Emoji" w:cs="Segoe UI Emoji"/>
-          <w:b/>
-          <w:bCs/>
-        </w:rPr>
-      </w:pPr>
-      <w:r>
-        <w:rPr>
-          <w:rFonts w:ascii="Segoe UI Emoji" w:hAnsi="Segoe UI Emoji" w:cs="Segoe UI Emoji"/>
-          <w:b/>
-          <w:bCs/>
-        </w:rPr>
-        <w:t>Vernengo Hipolito</w:t>
-      </w:r>
-    </w:p>
-    <w:p>
-      <w:pPr>
-        <w:rPr>
-          <w:rFonts w:ascii="Segoe UI Emoji" w:hAnsi="Segoe UI Emoji" w:cs="Segoe UI Emoji"/>
-          <w:b/>
-          <w:bCs/>
-        </w:rPr>
-      </w:pPr>
-    </w:p>
-    <w:p>
-      <w:pPr>
-        <w:rPr>
-          <w:rFonts w:ascii="Segoe UI Emoji" w:hAnsi="Segoe UI Emoji" w:cs="Segoe UI Emoji"/>
-        </w:rPr>
-      </w:pPr>
-      <w:r>
-        <w:rPr>
-          <w:rFonts w:ascii="Segoe UI Emoji" w:hAnsi="Segoe UI Emoji" w:cs="Segoe UI Emoji"/>
-        </w:rPr>
-        <w:t>🎉</w:t>
-      </w:r>
-      <w:r>
-        <w:t xml:space="preserve">¡Felicitaciones por la entrega del Desafío 07! </w:t>
-      </w:r>
-      <w:r>
-        <w:rPr>
-          <w:rFonts w:ascii="Segoe UI Emoji" w:hAnsi="Segoe UI Emoji" w:cs="Segoe UI Emoji"/>
-        </w:rPr>
-        <w:t>🎉</w:t>
-      </w:r>
-    </w:p>
-    <w:p/>
-    <w:p>
-      <w:r>
-        <w:t>Hipolito</w:t>
-      </w:r>
-      <w:r>
-        <w:t>, excelente trabajo, te felicito por el compromiso en realizar las entregas.</w:t>
-      </w:r>
-    </w:p>
-    <w:p/>
-    <w:p>
-      <w:r>
-        <w:t xml:space="preserve">Excelente la implementación de métodos para recorrer para arrays y objetos, diferenciaste correctamente los métodos splice y slice. </w:t>
-      </w:r>
-    </w:p>
-    <w:p/>
-    <w:p>
-      <w:r>
-        <w:t>Para evitar la repetición de código te manejaste correctamente con funciones con retorno y también de alto orden.</w:t>
-      </w:r>
-    </w:p>
-    <w:p/>
-    <w:p>
-      <w:r>
-        <w:t xml:space="preserve">Buenísimo que te manejaste con template literals en lugar de concatenar strings. </w:t>
+      <w:proofErr w:type="spellStart"/>
+      <w:r>
+        <w:t>literals</w:t>
+      </w:r>
+      <w:proofErr w:type="spellEnd"/>
+      <w:r>
+        <w:t xml:space="preserve"> en lugar de concatenar </w:t>
+      </w:r>
+      <w:proofErr w:type="spellStart"/>
+      <w:r>
+        <w:t>strings</w:t>
+      </w:r>
+      <w:proofErr w:type="spellEnd"/>
+      <w:r>
+        <w:t xml:space="preserve">. </w:t>
       </w:r>
     </w:p>
     <w:p/>
@@ -1279,7 +1826,23 @@
         </w:numPr>
       </w:pPr>
       <w:r>
-        <w:t>Me hubiera gustado que utilices al operador ternario, por ejemplo en el ejercicio nro 5</w:t>
+        <w:t xml:space="preserve">Me hubiera gustado que utilices al operador ternario, por </w:t>
+      </w:r>
+      <w:proofErr w:type="gramStart"/>
+      <w:r>
+        <w:t>ejemplo</w:t>
+      </w:r>
+      <w:proofErr w:type="gramEnd"/>
+      <w:r>
+        <w:t xml:space="preserve"> en el ejercicio </w:t>
+      </w:r>
+      <w:proofErr w:type="spellStart"/>
+      <w:r>
+        <w:t>nro</w:t>
+      </w:r>
+      <w:proofErr w:type="spellEnd"/>
+      <w:r>
+        <w:t xml:space="preserve"> 5</w:t>
       </w:r>
       <w:r>
         <w:t>:</w:t>
@@ -1293,16 +1856,42 @@
       <w:pPr>
         <w:ind w:left="1416"/>
       </w:pPr>
-      <w:r>
-        <w:t>const estado = promedio &gt;= 6 ? "Aprobado" : "Reprobado";</w:t>
+      <w:proofErr w:type="spellStart"/>
+      <w:r>
+        <w:t>const</w:t>
+      </w:r>
+      <w:proofErr w:type="spellEnd"/>
+      <w:r>
+        <w:t xml:space="preserve"> estado = promedio &gt;= </w:t>
+      </w:r>
+      <w:proofErr w:type="gramStart"/>
+      <w:r>
+        <w:t>6 ?</w:t>
+      </w:r>
+      <w:proofErr w:type="gramEnd"/>
+      <w:r>
+        <w:t xml:space="preserve"> "Aprobado</w:t>
+      </w:r>
+      <w:proofErr w:type="gramStart"/>
+      <w:r>
+        <w:t>" :</w:t>
+      </w:r>
+      <w:proofErr w:type="gramEnd"/>
+      <w:r>
+        <w:t xml:space="preserve"> "Reprobado";</w:t>
       </w:r>
     </w:p>
     <w:p>
       <w:pPr>
         <w:ind w:left="1416"/>
       </w:pPr>
-      <w:r>
-        <w:t>console.log(`Estado: ${estado}`);</w:t>
+      <w:proofErr w:type="gramStart"/>
+      <w:r>
+        <w:t>console.log(</w:t>
+      </w:r>
+      <w:proofErr w:type="gramEnd"/>
+      <w:r>
+        <w:t>`Estado: ${estado}`);</w:t>
       </w:r>
     </w:p>
     <w:p>
@@ -1325,11 +1914,32 @@
         </w:numPr>
       </w:pPr>
       <w:r>
-        <w:t>En el Ejercicio nro 1</w:t>
-      </w:r>
-      <w:r>
-        <w:t>0 podes realizar la sumatoria de notas en el primer bucle for junto con el console.log() :</w:t>
-      </w:r>
+        <w:t xml:space="preserve">En el Ejercicio </w:t>
+      </w:r>
+      <w:proofErr w:type="spellStart"/>
+      <w:r>
+        <w:t>nro</w:t>
+      </w:r>
+      <w:proofErr w:type="spellEnd"/>
+      <w:r>
+        <w:t xml:space="preserve"> 1</w:t>
+      </w:r>
+      <w:r>
+        <w:t xml:space="preserve">0 podes realizar la sumatoria de notas en el primer bucle </w:t>
+      </w:r>
+      <w:proofErr w:type="spellStart"/>
+      <w:r>
+        <w:t>for</w:t>
+      </w:r>
+      <w:proofErr w:type="spellEnd"/>
+      <w:r>
+        <w:t xml:space="preserve"> junto con el </w:t>
+      </w:r>
+      <w:proofErr w:type="gramStart"/>
+      <w:r>
+        <w:t>console.log() :</w:t>
+      </w:r>
+      <w:proofErr w:type="gramEnd"/>
     </w:p>
     <w:p>
       <w:pPr>
@@ -1343,12 +1953,50 @@
           <w:lang w:val="en-US"/>
         </w:rPr>
       </w:pPr>
+      <w:proofErr w:type="gramStart"/>
       <w:r>
         <w:rPr>
           <w:lang w:val="en-US"/>
         </w:rPr>
-        <w:t>for(let materia in calificaciones){</w:t>
-      </w:r>
+        <w:t>for(</w:t>
+      </w:r>
+      <w:proofErr w:type="gramEnd"/>
+      <w:r>
+        <w:rPr>
+          <w:lang w:val="en-US"/>
+        </w:rPr>
+        <w:t xml:space="preserve">let </w:t>
+      </w:r>
+      <w:proofErr w:type="spellStart"/>
+      <w:r>
+        <w:rPr>
+          <w:lang w:val="en-US"/>
+        </w:rPr>
+        <w:t>materia</w:t>
+      </w:r>
+      <w:proofErr w:type="spellEnd"/>
+      <w:r>
+        <w:rPr>
+          <w:lang w:val="en-US"/>
+        </w:rPr>
+        <w:t xml:space="preserve"> in </w:t>
+      </w:r>
+      <w:proofErr w:type="spellStart"/>
+      <w:proofErr w:type="gramStart"/>
+      <w:r>
+        <w:rPr>
+          <w:lang w:val="en-US"/>
+        </w:rPr>
+        <w:t>calificaciones</w:t>
+      </w:r>
+      <w:proofErr w:type="spellEnd"/>
+      <w:r>
+        <w:rPr>
+          <w:lang w:val="en-US"/>
+        </w:rPr>
+        <w:t>){</w:t>
+      </w:r>
+      <w:proofErr w:type="gramEnd"/>
     </w:p>
     <w:p>
       <w:pPr>
@@ -1360,8 +2008,13 @@
         </w:rPr>
         <w:t xml:space="preserve">    </w:t>
       </w:r>
-      <w:r>
-        <w:t>console.log(materia, ":", calificaciones[materia]);</w:t>
+      <w:proofErr w:type="gramStart"/>
+      <w:r>
+        <w:t>console.log(</w:t>
+      </w:r>
+      <w:proofErr w:type="gramEnd"/>
+      <w:r>
+        <w:t>materia, ":", calificaciones[materia]);</w:t>
       </w:r>
     </w:p>
     <w:p>
@@ -1391,7 +2044,55 @@
         </w:numPr>
       </w:pPr>
       <w:r>
-        <w:t>En el ejercicio nro 13 para la función esMayorDeEdad(value) no hace falta hacer un if, ya que la misma condición lógica va devolver con el return “true o false”:</w:t>
+        <w:t xml:space="preserve">En el ejercicio </w:t>
+      </w:r>
+      <w:proofErr w:type="spellStart"/>
+      <w:r>
+        <w:t>nro</w:t>
+      </w:r>
+      <w:proofErr w:type="spellEnd"/>
+      <w:r>
+        <w:t xml:space="preserve"> 13 para la función </w:t>
+      </w:r>
+      <w:proofErr w:type="spellStart"/>
+      <w:r>
+        <w:t>esMayorDeEdad</w:t>
+      </w:r>
+      <w:proofErr w:type="spellEnd"/>
+      <w:r>
+        <w:t>(</w:t>
+      </w:r>
+      <w:proofErr w:type="spellStart"/>
+      <w:r>
+        <w:t>value</w:t>
+      </w:r>
+      <w:proofErr w:type="spellEnd"/>
+      <w:r>
+        <w:t xml:space="preserve">) no hace falta hacer un </w:t>
+      </w:r>
+      <w:proofErr w:type="spellStart"/>
+      <w:r>
+        <w:t>if</w:t>
+      </w:r>
+      <w:proofErr w:type="spellEnd"/>
+      <w:r>
+        <w:t xml:space="preserve">, ya que la misma condición lógica </w:t>
+      </w:r>
+      <w:proofErr w:type="gramStart"/>
+      <w:r>
+        <w:t>va</w:t>
+      </w:r>
+      <w:proofErr w:type="gramEnd"/>
+      <w:r>
+        <w:t xml:space="preserve"> devolver con el </w:t>
+      </w:r>
+      <w:proofErr w:type="spellStart"/>
+      <w:r>
+        <w:t>return</w:t>
+      </w:r>
+      <w:proofErr w:type="spellEnd"/>
+      <w:r>
+        <w:t xml:space="preserve"> “true o false”:</w:t>
       </w:r>
     </w:p>
     <w:p/>
@@ -1399,9 +2100,22 @@
       <w:pPr>
         <w:ind w:left="1416"/>
       </w:pPr>
+      <w:proofErr w:type="spellStart"/>
       <w:r>
         <w:lastRenderedPageBreak/>
-        <w:t>function esMayorDeEdad(edad) {</w:t>
+        <w:t>function</w:t>
+      </w:r>
+      <w:proofErr w:type="spellEnd"/>
+      <w:r>
+        <w:t xml:space="preserve"> </w:t>
+      </w:r>
+      <w:proofErr w:type="spellStart"/>
+      <w:r>
+        <w:t>esMayorDeEdad</w:t>
+      </w:r>
+      <w:proofErr w:type="spellEnd"/>
+      <w:r>
+        <w:t>(edad) {</w:t>
       </w:r>
     </w:p>
     <w:p>
@@ -1409,7 +2123,15 @@
         <w:ind w:left="1416"/>
       </w:pPr>
       <w:r>
-        <w:t>  return edad &gt;= 18;</w:t>
+        <w:t xml:space="preserve">  </w:t>
+      </w:r>
+      <w:proofErr w:type="spellStart"/>
+      <w:r>
+        <w:t>return</w:t>
+      </w:r>
+      <w:proofErr w:type="spellEnd"/>
+      <w:r>
+        <w:t xml:space="preserve"> edad &gt;= 18;</w:t>
       </w:r>
     </w:p>
     <w:p>
@@ -1431,7 +2153,31 @@
         </w:numPr>
       </w:pPr>
       <w:r>
-        <w:t>Ejercicio nro 13: la anterior función con sintaxis de arrow function quedaría así:</w:t>
+        <w:t xml:space="preserve">Ejercicio </w:t>
+      </w:r>
+      <w:proofErr w:type="spellStart"/>
+      <w:r>
+        <w:t>nro</w:t>
+      </w:r>
+      <w:proofErr w:type="spellEnd"/>
+      <w:r>
+        <w:t xml:space="preserve"> 13: la anterior función con sintaxis de </w:t>
+      </w:r>
+      <w:proofErr w:type="spellStart"/>
+      <w:r>
+        <w:t>arrow</w:t>
+      </w:r>
+      <w:proofErr w:type="spellEnd"/>
+      <w:r>
+        <w:t xml:space="preserve"> </w:t>
+      </w:r>
+      <w:proofErr w:type="spellStart"/>
+      <w:r>
+        <w:t>function</w:t>
+      </w:r>
+      <w:proofErr w:type="spellEnd"/>
+      <w:r>
+        <w:t xml:space="preserve"> quedaría así:</w:t>
       </w:r>
     </w:p>
     <w:p>
@@ -1443,8 +2189,21 @@
       <w:pPr>
         <w:ind w:left="1416"/>
       </w:pPr>
-      <w:r>
-        <w:t>const esMayorDeEdadFn = (edad) =&gt; edad &gt;= 18;</w:t>
+      <w:proofErr w:type="spellStart"/>
+      <w:r>
+        <w:t>const</w:t>
+      </w:r>
+      <w:proofErr w:type="spellEnd"/>
+      <w:r>
+        <w:t xml:space="preserve"> </w:t>
+      </w:r>
+      <w:proofErr w:type="spellStart"/>
+      <w:r>
+        <w:t>esMayorDeEdadFn</w:t>
+      </w:r>
+      <w:proofErr w:type="spellEnd"/>
+      <w:r>
+        <w:t xml:space="preserve"> = (edad) =&gt; edad &gt;= 18;</w:t>
       </w:r>
     </w:p>
     <w:p/>
@@ -1515,6 +2274,7 @@
           <w:rFonts w:ascii="Segoe UI Emoji" w:hAnsi="Segoe UI Emoji" w:cs="Segoe UI Emoji"/>
         </w:rPr>
       </w:pPr>
+      <w:proofErr w:type="gramStart"/>
       <w:r>
         <w:rPr>
           <w:rFonts w:ascii="Segoe UI Emoji" w:hAnsi="Segoe UI Emoji" w:cs="Segoe UI Emoji"/>
@@ -1522,7 +2282,11 @@
         <w:t>🎉</w:t>
       </w:r>
       <w:r>
-        <w:t xml:space="preserve">¡Felicitaciones por la entrega del Desafío 08! </w:t>
+        <w:t>¡</w:t>
+      </w:r>
+      <w:proofErr w:type="gramEnd"/>
+      <w:r>
+        <w:t xml:space="preserve">Felicitaciones por la entrega del Desafío 08! </w:t>
       </w:r>
       <w:r>
         <w:rPr>
@@ -1547,7 +2311,15 @@
       </w:r>
       <w:r>
         <w:tab/>
-        <w:t>la selección de elementos del DOM y la manipulación de su contenido es correcto. También manipulaste correctamente clases y atributos con Dataset.</w:t>
+        <w:t xml:space="preserve">la selección de elementos del DOM y la manipulación de su contenido es correcto. También manipulaste correctamente clases y atributos con </w:t>
+      </w:r>
+      <w:proofErr w:type="spellStart"/>
+      <w:r>
+        <w:t>Dataset</w:t>
+      </w:r>
+      <w:proofErr w:type="spellEnd"/>
+      <w:r>
+        <w:t>.</w:t>
       </w:r>
     </w:p>
     <w:p>
@@ -1561,8 +2333,37 @@
           <w:u w:val="single"/>
         </w:rPr>
       </w:pPr>
-      <w:r>
-        <w:t>Buenisimo que aplicaste eventos con addEventListener, correcta la aplicación Event Delegation.</w:t>
+      <w:proofErr w:type="spellStart"/>
+      <w:r>
+        <w:t>Buenisimo</w:t>
+      </w:r>
+      <w:proofErr w:type="spellEnd"/>
+      <w:r>
+        <w:t xml:space="preserve"> que aplicaste eventos con </w:t>
+      </w:r>
+      <w:proofErr w:type="spellStart"/>
+      <w:r>
+        <w:t>addEventListener</w:t>
+      </w:r>
+      <w:proofErr w:type="spellEnd"/>
+      <w:r>
+        <w:t xml:space="preserve">, correcta la aplicación </w:t>
+      </w:r>
+      <w:proofErr w:type="spellStart"/>
+      <w:r>
+        <w:t>Event</w:t>
+      </w:r>
+      <w:proofErr w:type="spellEnd"/>
+      <w:r>
+        <w:t xml:space="preserve"> </w:t>
+      </w:r>
+      <w:proofErr w:type="spellStart"/>
+      <w:r>
+        <w:t>Delegation</w:t>
+      </w:r>
+      <w:proofErr w:type="spellEnd"/>
+      <w:r>
+        <w:t>.</w:t>
       </w:r>
     </w:p>
     <w:p/>
@@ -1648,6 +2449,7 @@
           <w:rFonts w:ascii="Segoe UI Emoji" w:hAnsi="Segoe UI Emoji" w:cs="Segoe UI Emoji"/>
         </w:rPr>
       </w:pPr>
+      <w:proofErr w:type="gramStart"/>
       <w:r>
         <w:rPr>
           <w:rFonts w:ascii="Segoe UI Emoji" w:hAnsi="Segoe UI Emoji" w:cs="Segoe UI Emoji"/>
@@ -1655,7 +2457,11 @@
         <w:t>🎉</w:t>
       </w:r>
       <w:r>
-        <w:t xml:space="preserve">¡Felicitaciones por la entrega del Desafío 07! </w:t>
+        <w:t>¡</w:t>
+      </w:r>
+      <w:proofErr w:type="gramEnd"/>
+      <w:r>
+        <w:t xml:space="preserve">Felicitaciones por la entrega del Desafío 07! </w:t>
       </w:r>
       <w:r>
         <w:rPr>
@@ -1673,7 +2479,31 @@
     <w:p/>
     <w:p>
       <w:r>
-        <w:t xml:space="preserve">Excelente la implementación de métodos para recorrer para arrays y objetos, diferenciaste correctamente los métodos splice y slice. </w:t>
+        <w:t xml:space="preserve">Excelente la implementación de métodos para recorrer para </w:t>
+      </w:r>
+      <w:proofErr w:type="spellStart"/>
+      <w:r>
+        <w:t>arrays</w:t>
+      </w:r>
+      <w:proofErr w:type="spellEnd"/>
+      <w:r>
+        <w:t xml:space="preserve"> y objetos, diferenciaste correctamente los métodos </w:t>
+      </w:r>
+      <w:proofErr w:type="spellStart"/>
+      <w:r>
+        <w:t>splice</w:t>
+      </w:r>
+      <w:proofErr w:type="spellEnd"/>
+      <w:r>
+        <w:t xml:space="preserve"> y </w:t>
+      </w:r>
+      <w:proofErr w:type="spellStart"/>
+      <w:r>
+        <w:t>slice</w:t>
+      </w:r>
+      <w:proofErr w:type="spellEnd"/>
+      <w:r>
+        <w:t xml:space="preserve">. </w:t>
       </w:r>
     </w:p>
     <w:p/>
@@ -1685,10 +2515,42 @@
     <w:p/>
     <w:p>
       <w:r>
-        <w:t xml:space="preserve">Buenísimo que te manejaste con template literals en lugar de concatenar strings. </w:t>
-      </w:r>
-      <w:r>
-        <w:t>Genial que hiciste el punto adicional en el ultimo ejercicio.</w:t>
+        <w:t xml:space="preserve">Buenísimo que te manejaste con </w:t>
+      </w:r>
+      <w:proofErr w:type="spellStart"/>
+      <w:r>
+        <w:t>template</w:t>
+      </w:r>
+      <w:proofErr w:type="spellEnd"/>
+      <w:r>
+        <w:t xml:space="preserve"> </w:t>
+      </w:r>
+      <w:proofErr w:type="spellStart"/>
+      <w:r>
+        <w:t>literals</w:t>
+      </w:r>
+      <w:proofErr w:type="spellEnd"/>
+      <w:r>
+        <w:t xml:space="preserve"> en lugar de concatenar </w:t>
+      </w:r>
+      <w:proofErr w:type="spellStart"/>
+      <w:r>
+        <w:t>strings</w:t>
+      </w:r>
+      <w:proofErr w:type="spellEnd"/>
+      <w:r>
+        <w:t xml:space="preserve">. </w:t>
+      </w:r>
+      <w:r>
+        <w:t xml:space="preserve">Genial que hiciste el punto adicional en el </w:t>
+      </w:r>
+      <w:proofErr w:type="spellStart"/>
+      <w:r>
+        <w:t>ultimo</w:t>
+      </w:r>
+      <w:proofErr w:type="spellEnd"/>
+      <w:r>
+        <w:t xml:space="preserve"> ejercicio.</w:t>
       </w:r>
     </w:p>
     <w:p/>
@@ -1713,8 +2575,21 @@
           <w:numId w:val="6"/>
         </w:numPr>
       </w:pPr>
-      <w:r>
-        <w:t xml:space="preserve">Recorda que para poder insertar expresiones JS (${…}) en textos necesitas los backticks  </w:t>
+      <w:proofErr w:type="spellStart"/>
+      <w:r>
+        <w:t>Recorda</w:t>
+      </w:r>
+      <w:proofErr w:type="spellEnd"/>
+      <w:r>
+        <w:t xml:space="preserve"> que para poder insertar expresiones JS (${…}) en textos necesitas los </w:t>
+      </w:r>
+      <w:proofErr w:type="spellStart"/>
+      <w:r>
+        <w:t>backticks</w:t>
+      </w:r>
+      <w:proofErr w:type="spellEnd"/>
+      <w:r>
+        <w:t xml:space="preserve">  </w:t>
       </w:r>
     </w:p>
     <w:p>
@@ -1730,7 +2605,15 @@
         <w:tab/>
       </w:r>
       <w:r>
-        <w:t>console.log(`${materia}: ${calificaciones[materia]}`);</w:t>
+        <w:t>console.log(`${materia}: ${calificaciones[materia</w:t>
+      </w:r>
+      <w:proofErr w:type="gramStart"/>
+      <w:r>
+        <w:t>]}`</w:t>
+      </w:r>
+      <w:proofErr w:type="gramEnd"/>
+      <w:r>
+        <w:t>);</w:t>
       </w:r>
     </w:p>
     <w:p/>
@@ -1750,8 +2633,29 @@
         </w:numPr>
       </w:pPr>
       <w:r>
-        <w:t>En el Ejercicio nro 10 podes realizar la sumatoria de notas en el primer bucle for junto con el console.log() :</w:t>
-      </w:r>
+        <w:t xml:space="preserve">En el Ejercicio </w:t>
+      </w:r>
+      <w:proofErr w:type="spellStart"/>
+      <w:r>
+        <w:t>nro</w:t>
+      </w:r>
+      <w:proofErr w:type="spellEnd"/>
+      <w:r>
+        <w:t xml:space="preserve"> 10 podes realizar la sumatoria de notas en el primer bucle </w:t>
+      </w:r>
+      <w:proofErr w:type="spellStart"/>
+      <w:r>
+        <w:t>for</w:t>
+      </w:r>
+      <w:proofErr w:type="spellEnd"/>
+      <w:r>
+        <w:t xml:space="preserve"> junto con el </w:t>
+      </w:r>
+      <w:proofErr w:type="gramStart"/>
+      <w:r>
+        <w:t>console.log() :</w:t>
+      </w:r>
+      <w:proofErr w:type="gramEnd"/>
     </w:p>
     <w:p>
       <w:pPr>
@@ -1765,12 +2669,50 @@
           <w:lang w:val="en-US"/>
         </w:rPr>
       </w:pPr>
+      <w:proofErr w:type="gramStart"/>
       <w:r>
         <w:rPr>
           <w:lang w:val="en-US"/>
         </w:rPr>
-        <w:t>for(let materia in calificaciones){</w:t>
-      </w:r>
+        <w:t>for(</w:t>
+      </w:r>
+      <w:proofErr w:type="gramEnd"/>
+      <w:r>
+        <w:rPr>
+          <w:lang w:val="en-US"/>
+        </w:rPr>
+        <w:t xml:space="preserve">let </w:t>
+      </w:r>
+      <w:proofErr w:type="spellStart"/>
+      <w:r>
+        <w:rPr>
+          <w:lang w:val="en-US"/>
+        </w:rPr>
+        <w:t>materia</w:t>
+      </w:r>
+      <w:proofErr w:type="spellEnd"/>
+      <w:r>
+        <w:rPr>
+          <w:lang w:val="en-US"/>
+        </w:rPr>
+        <w:t xml:space="preserve"> in </w:t>
+      </w:r>
+      <w:proofErr w:type="spellStart"/>
+      <w:proofErr w:type="gramStart"/>
+      <w:r>
+        <w:rPr>
+          <w:lang w:val="en-US"/>
+        </w:rPr>
+        <w:t>calificaciones</w:t>
+      </w:r>
+      <w:proofErr w:type="spellEnd"/>
+      <w:r>
+        <w:rPr>
+          <w:lang w:val="en-US"/>
+        </w:rPr>
+        <w:t>){</w:t>
+      </w:r>
+      <w:proofErr w:type="gramEnd"/>
     </w:p>
     <w:p>
       <w:pPr>
@@ -1782,8 +2724,13 @@
         </w:rPr>
         <w:t xml:space="preserve">    </w:t>
       </w:r>
-      <w:r>
-        <w:t>console.log(materia, ":", calificaciones[materia]);</w:t>
+      <w:proofErr w:type="gramStart"/>
+      <w:r>
+        <w:t>console.log(</w:t>
+      </w:r>
+      <w:proofErr w:type="gramEnd"/>
+      <w:r>
+        <w:t>materia, ":", calificaciones[materia]);</w:t>
       </w:r>
     </w:p>
     <w:p>
@@ -1840,30 +2787,41 @@
           <w:bCs/>
         </w:rPr>
       </w:pPr>
-      <w:r>
-        <w:rPr>
-          <w:rFonts w:ascii="Segoe UI Emoji" w:hAnsi="Segoe UI Emoji" w:cs="Segoe UI Emoji"/>
-          <w:b/>
-          <w:bCs/>
-        </w:rPr>
-        <w:t>Perezlindo Franco</w:t>
-      </w:r>
-    </w:p>
-    <w:p>
-      <w:pPr>
-        <w:rPr>
-          <w:rFonts w:ascii="Segoe UI Emoji" w:hAnsi="Segoe UI Emoji" w:cs="Segoe UI Emoji"/>
-          <w:b/>
-          <w:bCs/>
-        </w:rPr>
-      </w:pPr>
-    </w:p>
-    <w:p>
-      <w:pPr>
-        <w:rPr>
-          <w:rFonts w:ascii="Segoe UI Emoji" w:hAnsi="Segoe UI Emoji" w:cs="Segoe UI Emoji"/>
-        </w:rPr>
-      </w:pPr>
+      <w:proofErr w:type="spellStart"/>
+      <w:r>
+        <w:rPr>
+          <w:rFonts w:ascii="Segoe UI Emoji" w:hAnsi="Segoe UI Emoji" w:cs="Segoe UI Emoji"/>
+          <w:b/>
+          <w:bCs/>
+        </w:rPr>
+        <w:t>Perezlindo</w:t>
+      </w:r>
+      <w:proofErr w:type="spellEnd"/>
+      <w:r>
+        <w:rPr>
+          <w:rFonts w:ascii="Segoe UI Emoji" w:hAnsi="Segoe UI Emoji" w:cs="Segoe UI Emoji"/>
+          <w:b/>
+          <w:bCs/>
+        </w:rPr>
+        <w:t xml:space="preserve"> Franco</w:t>
+      </w:r>
+    </w:p>
+    <w:p>
+      <w:pPr>
+        <w:rPr>
+          <w:rFonts w:ascii="Segoe UI Emoji" w:hAnsi="Segoe UI Emoji" w:cs="Segoe UI Emoji"/>
+          <w:b/>
+          <w:bCs/>
+        </w:rPr>
+      </w:pPr>
+    </w:p>
+    <w:p>
+      <w:pPr>
+        <w:rPr>
+          <w:rFonts w:ascii="Segoe UI Emoji" w:hAnsi="Segoe UI Emoji" w:cs="Segoe UI Emoji"/>
+        </w:rPr>
+      </w:pPr>
+      <w:proofErr w:type="gramStart"/>
       <w:r>
         <w:rPr>
           <w:rFonts w:ascii="Segoe UI Emoji" w:hAnsi="Segoe UI Emoji" w:cs="Segoe UI Emoji"/>
@@ -1871,7 +2829,11 @@
         <w:t>🎉</w:t>
       </w:r>
       <w:r>
-        <w:t xml:space="preserve">¡Felicitaciones por la entrega del Desafío 08! </w:t>
+        <w:t>¡</w:t>
+      </w:r>
+      <w:proofErr w:type="gramEnd"/>
+      <w:r>
+        <w:t xml:space="preserve">Felicitaciones por la entrega del Desafío 08! </w:t>
       </w:r>
       <w:r>
         <w:rPr>
@@ -1896,7 +2858,15 @@
       </w:r>
       <w:r>
         <w:tab/>
-        <w:t>la selección de elementos del DOM y la manipulación de su contenido es correcto. También manipulaste correctamente clases y atributos con Dataset.</w:t>
+        <w:t xml:space="preserve">la selección de elementos del DOM y la manipulación de su contenido es correcto. También manipulaste correctamente clases y atributos con </w:t>
+      </w:r>
+      <w:proofErr w:type="spellStart"/>
+      <w:r>
+        <w:t>Dataset</w:t>
+      </w:r>
+      <w:proofErr w:type="spellEnd"/>
+      <w:r>
+        <w:t>.</w:t>
       </w:r>
     </w:p>
     <w:p>
@@ -1910,8 +2880,37 @@
           <w:u w:val="single"/>
         </w:rPr>
       </w:pPr>
-      <w:r>
-        <w:t>Buenisimo que aplicaste eventos con addEventListener, correcta la aplicación Event Delegation.</w:t>
+      <w:proofErr w:type="spellStart"/>
+      <w:r>
+        <w:t>Buenisimo</w:t>
+      </w:r>
+      <w:proofErr w:type="spellEnd"/>
+      <w:r>
+        <w:t xml:space="preserve"> que aplicaste eventos con </w:t>
+      </w:r>
+      <w:proofErr w:type="spellStart"/>
+      <w:r>
+        <w:t>addEventListener</w:t>
+      </w:r>
+      <w:proofErr w:type="spellEnd"/>
+      <w:r>
+        <w:t xml:space="preserve">, correcta la aplicación </w:t>
+      </w:r>
+      <w:proofErr w:type="spellStart"/>
+      <w:r>
+        <w:t>Event</w:t>
+      </w:r>
+      <w:proofErr w:type="spellEnd"/>
+      <w:r>
+        <w:t xml:space="preserve"> </w:t>
+      </w:r>
+      <w:proofErr w:type="spellStart"/>
+      <w:r>
+        <w:t>Delegation</w:t>
+      </w:r>
+      <w:proofErr w:type="spellEnd"/>
+      <w:r>
+        <w:t>.</w:t>
       </w:r>
     </w:p>
     <w:p/>
@@ -1979,8 +2978,36 @@
           <w:b/>
           <w:bCs/>
         </w:rPr>
-        <w:t>Zuñiga Hernandez Carlos Andres</w:t>
-      </w:r>
+        <w:t xml:space="preserve">Zuñiga </w:t>
+      </w:r>
+      <w:proofErr w:type="spellStart"/>
+      <w:r>
+        <w:rPr>
+          <w:rFonts w:ascii="Segoe UI Emoji" w:hAnsi="Segoe UI Emoji" w:cs="Segoe UI Emoji"/>
+          <w:b/>
+          <w:bCs/>
+        </w:rPr>
+        <w:t>Hernandez</w:t>
+      </w:r>
+      <w:proofErr w:type="spellEnd"/>
+      <w:r>
+        <w:rPr>
+          <w:rFonts w:ascii="Segoe UI Emoji" w:hAnsi="Segoe UI Emoji" w:cs="Segoe UI Emoji"/>
+          <w:b/>
+          <w:bCs/>
+        </w:rPr>
+        <w:t xml:space="preserve"> Carlos </w:t>
+      </w:r>
+      <w:proofErr w:type="spellStart"/>
+      <w:r>
+        <w:rPr>
+          <w:rFonts w:ascii="Segoe UI Emoji" w:hAnsi="Segoe UI Emoji" w:cs="Segoe UI Emoji"/>
+          <w:b/>
+          <w:bCs/>
+        </w:rPr>
+        <w:t>Andres</w:t>
+      </w:r>
+      <w:proofErr w:type="spellEnd"/>
     </w:p>
     <w:p>
       <w:pPr>
@@ -1999,6 +3026,7 @@
           <w:rFonts w:ascii="Segoe UI Emoji" w:hAnsi="Segoe UI Emoji" w:cs="Segoe UI Emoji"/>
         </w:rPr>
       </w:pPr>
+      <w:proofErr w:type="gramStart"/>
       <w:r>
         <w:rPr>
           <w:rFonts w:ascii="Segoe UI Emoji" w:hAnsi="Segoe UI Emoji" w:cs="Segoe UI Emoji"/>
@@ -2006,7 +3034,11 @@
         <w:t>🎉</w:t>
       </w:r>
       <w:r>
-        <w:t xml:space="preserve">¡Felicitaciones por la entrega del Desafío 04! </w:t>
+        <w:t>¡</w:t>
+      </w:r>
+      <w:proofErr w:type="gramEnd"/>
+      <w:r>
+        <w:t xml:space="preserve">Felicitaciones por la entrega del Desafío 04! </w:t>
       </w:r>
       <w:r>
         <w:rPr>
@@ -2044,7 +3076,31 @@
         <w:ind w:left="708" w:hanging="708"/>
       </w:pPr>
       <w:r>
-        <w:t>La estructura HTML esta impecable, destaco la correcta implementación de contenedores semánticos como main, section, footer, etc.</w:t>
+        <w:t xml:space="preserve">La estructura HTML esta impecable, destaco la correcta implementación de contenedores semánticos como </w:t>
+      </w:r>
+      <w:proofErr w:type="spellStart"/>
+      <w:r>
+        <w:t>main</w:t>
+      </w:r>
+      <w:proofErr w:type="spellEnd"/>
+      <w:r>
+        <w:t xml:space="preserve">, </w:t>
+      </w:r>
+      <w:proofErr w:type="spellStart"/>
+      <w:r>
+        <w:t>section</w:t>
+      </w:r>
+      <w:proofErr w:type="spellEnd"/>
+      <w:r>
+        <w:t xml:space="preserve">, </w:t>
+      </w:r>
+      <w:proofErr w:type="spellStart"/>
+      <w:r>
+        <w:t>footer</w:t>
+      </w:r>
+      <w:proofErr w:type="spellEnd"/>
+      <w:r>
+        <w:t>, etc.</w:t>
       </w:r>
     </w:p>
     <w:p>
@@ -2070,7 +3126,15 @@
         <w:ind w:left="708" w:hanging="708"/>
       </w:pPr>
       <w:r>
-        <w:t>La disposición de elementos en la landing page quedo tal cual lo solicitado con la herramienta Flex.</w:t>
+        <w:t xml:space="preserve">La disposición de elementos en la </w:t>
+      </w:r>
+      <w:proofErr w:type="spellStart"/>
+      <w:r>
+        <w:t>landing</w:t>
+      </w:r>
+      <w:proofErr w:type="spellEnd"/>
+      <w:r>
+        <w:t xml:space="preserve"> page quedo tal cual lo solicitado con la herramienta Flex.</w:t>
       </w:r>
     </w:p>
     <w:p>
@@ -2147,30 +3211,41 @@
           <w:bCs/>
         </w:rPr>
       </w:pPr>
-      <w:r>
-        <w:rPr>
-          <w:rFonts w:ascii="Segoe UI Emoji" w:hAnsi="Segoe UI Emoji" w:cs="Segoe UI Emoji"/>
-          <w:b/>
-          <w:bCs/>
-        </w:rPr>
-        <w:t>Bravo Sergio</w:t>
-      </w:r>
-    </w:p>
-    <w:p>
-      <w:pPr>
-        <w:rPr>
-          <w:rFonts w:ascii="Segoe UI Emoji" w:hAnsi="Segoe UI Emoji" w:cs="Segoe UI Emoji"/>
-          <w:b/>
-          <w:bCs/>
-        </w:rPr>
-      </w:pPr>
-    </w:p>
-    <w:p>
-      <w:pPr>
-        <w:rPr>
-          <w:rFonts w:ascii="Segoe UI Emoji" w:hAnsi="Segoe UI Emoji" w:cs="Segoe UI Emoji"/>
-        </w:rPr>
-      </w:pPr>
+      <w:proofErr w:type="gramStart"/>
+      <w:r>
+        <w:rPr>
+          <w:rFonts w:ascii="Segoe UI Emoji" w:hAnsi="Segoe UI Emoji" w:cs="Segoe UI Emoji"/>
+          <w:b/>
+          <w:bCs/>
+        </w:rPr>
+        <w:t>Bravo</w:t>
+      </w:r>
+      <w:proofErr w:type="gramEnd"/>
+      <w:r>
+        <w:rPr>
+          <w:rFonts w:ascii="Segoe UI Emoji" w:hAnsi="Segoe UI Emoji" w:cs="Segoe UI Emoji"/>
+          <w:b/>
+          <w:bCs/>
+        </w:rPr>
+        <w:t xml:space="preserve"> Sergio</w:t>
+      </w:r>
+    </w:p>
+    <w:p>
+      <w:pPr>
+        <w:rPr>
+          <w:rFonts w:ascii="Segoe UI Emoji" w:hAnsi="Segoe UI Emoji" w:cs="Segoe UI Emoji"/>
+          <w:b/>
+          <w:bCs/>
+        </w:rPr>
+      </w:pPr>
+    </w:p>
+    <w:p>
+      <w:pPr>
+        <w:rPr>
+          <w:rFonts w:ascii="Segoe UI Emoji" w:hAnsi="Segoe UI Emoji" w:cs="Segoe UI Emoji"/>
+        </w:rPr>
+      </w:pPr>
+      <w:proofErr w:type="gramStart"/>
       <w:r>
         <w:rPr>
           <w:rFonts w:ascii="Segoe UI Emoji" w:hAnsi="Segoe UI Emoji" w:cs="Segoe UI Emoji"/>
@@ -2178,7 +3253,11 @@
         <w:t>🎉</w:t>
       </w:r>
       <w:r>
-        <w:t xml:space="preserve">¡Felicitaciones por la entrega del Desafío 01! </w:t>
+        <w:t>¡</w:t>
+      </w:r>
+      <w:proofErr w:type="gramEnd"/>
+      <w:r>
+        <w:t xml:space="preserve">Felicitaciones por la entrega del Desafío 01! </w:t>
       </w:r>
       <w:r>
         <w:rPr>
@@ -2208,7 +3287,23 @@
     <w:p/>
     <w:p>
       <w:r>
-        <w:t xml:space="preserve">Buenísimo que aplicaste etiquetas &lt;b&gt; para resaltar en negrita textos, te falto aplicar palabras claves con etiquetas &lt;strong&gt;, recorda que ayudan para que los motores de búsqueda entiendan mejor el contenido de tu documento web. </w:t>
+        <w:t>Buenísimo que aplicaste etiquetas &lt;b&gt; para resaltar en negrita textos, te falto aplicar palabras claves con etiquetas &lt;</w:t>
+      </w:r>
+      <w:proofErr w:type="spellStart"/>
+      <w:r>
+        <w:t>strong</w:t>
+      </w:r>
+      <w:proofErr w:type="spellEnd"/>
+      <w:r>
+        <w:t xml:space="preserve">&gt;, </w:t>
+      </w:r>
+      <w:proofErr w:type="spellStart"/>
+      <w:r>
+        <w:t>recorda</w:t>
+      </w:r>
+      <w:proofErr w:type="spellEnd"/>
+      <w:r>
+        <w:t xml:space="preserve"> que ayudan para que los motores de búsqueda entiendan mejor el contenido de tu documento web. </w:t>
       </w:r>
     </w:p>
     <w:p/>
@@ -2272,6 +3367,7 @@
           <w:rFonts w:ascii="Segoe UI Emoji" w:hAnsi="Segoe UI Emoji" w:cs="Segoe UI Emoji"/>
         </w:rPr>
       </w:pPr>
+      <w:proofErr w:type="gramStart"/>
       <w:r>
         <w:rPr>
           <w:rFonts w:ascii="Segoe UI Emoji" w:hAnsi="Segoe UI Emoji" w:cs="Segoe UI Emoji"/>
@@ -2279,7 +3375,11 @@
         <w:t>🎉</w:t>
       </w:r>
       <w:r>
-        <w:t xml:space="preserve">¡Felicitaciones por la entrega del Desafío 08! </w:t>
+        <w:t>¡</w:t>
+      </w:r>
+      <w:proofErr w:type="gramEnd"/>
+      <w:r>
+        <w:t xml:space="preserve">Felicitaciones por la entrega del Desafío 08! </w:t>
       </w:r>
       <w:r>
         <w:rPr>
@@ -2304,7 +3404,15 @@
       </w:r>
       <w:r>
         <w:tab/>
-        <w:t>la selección de elementos del DOM y la manipulación de su contenido es correcto. También manipulaste correctamente clases y atributos con Dataset.</w:t>
+        <w:t xml:space="preserve">la selección de elementos del DOM y la manipulación de su contenido es correcto. También manipulaste correctamente clases y atributos con </w:t>
+      </w:r>
+      <w:proofErr w:type="spellStart"/>
+      <w:r>
+        <w:t>Dataset</w:t>
+      </w:r>
+      <w:proofErr w:type="spellEnd"/>
+      <w:r>
+        <w:t>.</w:t>
       </w:r>
     </w:p>
     <w:p>
@@ -2318,8 +3426,37 @@
           <w:u w:val="single"/>
         </w:rPr>
       </w:pPr>
-      <w:r>
-        <w:t>Buenisimo que aplicaste eventos con addEventListener, correcta la aplicación Event Delegation.</w:t>
+      <w:proofErr w:type="spellStart"/>
+      <w:r>
+        <w:t>Buenisimo</w:t>
+      </w:r>
+      <w:proofErr w:type="spellEnd"/>
+      <w:r>
+        <w:t xml:space="preserve"> que aplicaste eventos con </w:t>
+      </w:r>
+      <w:proofErr w:type="spellStart"/>
+      <w:r>
+        <w:t>addEventListener</w:t>
+      </w:r>
+      <w:proofErr w:type="spellEnd"/>
+      <w:r>
+        <w:t xml:space="preserve">, correcta la aplicación </w:t>
+      </w:r>
+      <w:proofErr w:type="spellStart"/>
+      <w:r>
+        <w:t>Event</w:t>
+      </w:r>
+      <w:proofErr w:type="spellEnd"/>
+      <w:r>
+        <w:t xml:space="preserve"> </w:t>
+      </w:r>
+      <w:proofErr w:type="spellStart"/>
+      <w:r>
+        <w:t>Delegation</w:t>
+      </w:r>
+      <w:proofErr w:type="spellEnd"/>
+      <w:r>
+        <w:t>.</w:t>
       </w:r>
     </w:p>
     <w:p/>
@@ -2391,39 +3528,50 @@
           <w:bCs/>
         </w:rPr>
       </w:pPr>
-      <w:r>
-        <w:rPr>
-          <w:rFonts w:ascii="Segoe UI Emoji" w:hAnsi="Segoe UI Emoji" w:cs="Segoe UI Emoji"/>
-          <w:b/>
-          <w:bCs/>
-        </w:rPr>
-        <w:t>Imas Guerrero Catalina Eva</w:t>
-      </w:r>
-    </w:p>
-    <w:p>
-      <w:pPr>
-        <w:rPr>
-          <w:rFonts w:ascii="Segoe UI Emoji" w:hAnsi="Segoe UI Emoji" w:cs="Segoe UI Emoji"/>
-          <w:b/>
-          <w:bCs/>
-        </w:rPr>
-      </w:pPr>
-    </w:p>
-    <w:p>
-      <w:pPr>
-        <w:rPr>
-          <w:rFonts w:ascii="Segoe UI Emoji" w:hAnsi="Segoe UI Emoji" w:cs="Segoe UI Emoji"/>
-          <w:b/>
-          <w:bCs/>
-        </w:rPr>
-      </w:pPr>
-    </w:p>
-    <w:p>
-      <w:pPr>
-        <w:rPr>
-          <w:rFonts w:ascii="Segoe UI Emoji" w:hAnsi="Segoe UI Emoji" w:cs="Segoe UI Emoji"/>
-        </w:rPr>
-      </w:pPr>
+      <w:proofErr w:type="spellStart"/>
+      <w:r>
+        <w:rPr>
+          <w:rFonts w:ascii="Segoe UI Emoji" w:hAnsi="Segoe UI Emoji" w:cs="Segoe UI Emoji"/>
+          <w:b/>
+          <w:bCs/>
+        </w:rPr>
+        <w:t>Imas</w:t>
+      </w:r>
+      <w:proofErr w:type="spellEnd"/>
+      <w:r>
+        <w:rPr>
+          <w:rFonts w:ascii="Segoe UI Emoji" w:hAnsi="Segoe UI Emoji" w:cs="Segoe UI Emoji"/>
+          <w:b/>
+          <w:bCs/>
+        </w:rPr>
+        <w:t xml:space="preserve"> Guerrero Catalina Eva</w:t>
+      </w:r>
+    </w:p>
+    <w:p>
+      <w:pPr>
+        <w:rPr>
+          <w:rFonts w:ascii="Segoe UI Emoji" w:hAnsi="Segoe UI Emoji" w:cs="Segoe UI Emoji"/>
+          <w:b/>
+          <w:bCs/>
+        </w:rPr>
+      </w:pPr>
+    </w:p>
+    <w:p>
+      <w:pPr>
+        <w:rPr>
+          <w:rFonts w:ascii="Segoe UI Emoji" w:hAnsi="Segoe UI Emoji" w:cs="Segoe UI Emoji"/>
+          <w:b/>
+          <w:bCs/>
+        </w:rPr>
+      </w:pPr>
+    </w:p>
+    <w:p>
+      <w:pPr>
+        <w:rPr>
+          <w:rFonts w:ascii="Segoe UI Emoji" w:hAnsi="Segoe UI Emoji" w:cs="Segoe UI Emoji"/>
+        </w:rPr>
+      </w:pPr>
+      <w:proofErr w:type="gramStart"/>
       <w:r>
         <w:rPr>
           <w:rFonts w:ascii="Segoe UI Emoji" w:hAnsi="Segoe UI Emoji" w:cs="Segoe UI Emoji"/>
@@ -2431,7 +3579,11 @@
         <w:t>🎉</w:t>
       </w:r>
       <w:r>
-        <w:t>¡Felicitaciones por la entrega del Desafío 0</w:t>
+        <w:t>¡</w:t>
+      </w:r>
+      <w:proofErr w:type="gramEnd"/>
+      <w:r>
+        <w:t>Felicitaciones por la entrega del Desafío 0</w:t>
       </w:r>
       <w:r>
         <w:t>8</w:t>
@@ -2462,7 +3614,15 @@
       </w:r>
       <w:r>
         <w:tab/>
-        <w:t>la selección de elementos del DOM y la manipulación de su contenido es correcto. También manipulaste correctamente clases y atributos con Dataset.</w:t>
+        <w:t xml:space="preserve">la selección de elementos del DOM y la manipulación de su contenido es correcto. También manipulaste correctamente clases y atributos con </w:t>
+      </w:r>
+      <w:proofErr w:type="spellStart"/>
+      <w:r>
+        <w:t>Dataset</w:t>
+      </w:r>
+      <w:proofErr w:type="spellEnd"/>
+      <w:r>
+        <w:t>.</w:t>
       </w:r>
     </w:p>
     <w:p>
@@ -2476,8 +3636,37 @@
           <w:u w:val="single"/>
         </w:rPr>
       </w:pPr>
-      <w:r>
-        <w:t>Buenisimo que aplicaste eventos con addEventListener, correcta la aplicación Event Delegation.</w:t>
+      <w:proofErr w:type="spellStart"/>
+      <w:r>
+        <w:t>Buenisimo</w:t>
+      </w:r>
+      <w:proofErr w:type="spellEnd"/>
+      <w:r>
+        <w:t xml:space="preserve"> que aplicaste eventos con </w:t>
+      </w:r>
+      <w:proofErr w:type="spellStart"/>
+      <w:r>
+        <w:t>addEventListener</w:t>
+      </w:r>
+      <w:proofErr w:type="spellEnd"/>
+      <w:r>
+        <w:t xml:space="preserve">, correcta la aplicación </w:t>
+      </w:r>
+      <w:proofErr w:type="spellStart"/>
+      <w:r>
+        <w:t>Event</w:t>
+      </w:r>
+      <w:proofErr w:type="spellEnd"/>
+      <w:r>
+        <w:t xml:space="preserve"> </w:t>
+      </w:r>
+      <w:proofErr w:type="spellStart"/>
+      <w:r>
+        <w:t>Delegation</w:t>
+      </w:r>
+      <w:proofErr w:type="spellEnd"/>
+      <w:r>
+        <w:t>.</w:t>
       </w:r>
     </w:p>
     <w:p/>
@@ -2565,6 +3754,7 @@
           <w:rFonts w:ascii="Segoe UI Emoji" w:hAnsi="Segoe UI Emoji" w:cs="Segoe UI Emoji"/>
         </w:rPr>
       </w:pPr>
+      <w:proofErr w:type="gramStart"/>
       <w:r>
         <w:rPr>
           <w:rFonts w:ascii="Segoe UI Emoji" w:hAnsi="Segoe UI Emoji" w:cs="Segoe UI Emoji"/>
@@ -2572,7 +3762,11 @@
         <w:t>🎉</w:t>
       </w:r>
       <w:r>
-        <w:t xml:space="preserve">¡Felicitaciones por la entrega del Desafío 08! </w:t>
+        <w:t>¡</w:t>
+      </w:r>
+      <w:proofErr w:type="gramEnd"/>
+      <w:r>
+        <w:t xml:space="preserve">Felicitaciones por la entrega del Desafío 08! </w:t>
       </w:r>
       <w:r>
         <w:rPr>
@@ -2597,7 +3791,15 @@
       </w:r>
       <w:r>
         <w:tab/>
-        <w:t>la selección de elementos del DOM y la manipulación de su contenido es correcto. También manipulaste correctamente clases y atributos con Dataset.</w:t>
+        <w:t xml:space="preserve">la selección de elementos del DOM y la manipulación de su contenido es correcto. También manipulaste correctamente clases y atributos con </w:t>
+      </w:r>
+      <w:proofErr w:type="spellStart"/>
+      <w:r>
+        <w:t>Dataset</w:t>
+      </w:r>
+      <w:proofErr w:type="spellEnd"/>
+      <w:r>
+        <w:t>.</w:t>
       </w:r>
     </w:p>
     <w:p>
@@ -2611,8 +3813,37 @@
           <w:u w:val="single"/>
         </w:rPr>
       </w:pPr>
-      <w:r>
-        <w:t>Buenisimo que aplicaste eventos con addEventListener, correcta la aplicación Event Delegation.</w:t>
+      <w:proofErr w:type="spellStart"/>
+      <w:r>
+        <w:t>Buenisimo</w:t>
+      </w:r>
+      <w:proofErr w:type="spellEnd"/>
+      <w:r>
+        <w:t xml:space="preserve"> que aplicaste eventos con </w:t>
+      </w:r>
+      <w:proofErr w:type="spellStart"/>
+      <w:r>
+        <w:t>addEventListener</w:t>
+      </w:r>
+      <w:proofErr w:type="spellEnd"/>
+      <w:r>
+        <w:t xml:space="preserve">, correcta la aplicación </w:t>
+      </w:r>
+      <w:proofErr w:type="spellStart"/>
+      <w:r>
+        <w:t>Event</w:t>
+      </w:r>
+      <w:proofErr w:type="spellEnd"/>
+      <w:r>
+        <w:t xml:space="preserve"> </w:t>
+      </w:r>
+      <w:proofErr w:type="spellStart"/>
+      <w:r>
+        <w:t>Delegation</w:t>
+      </w:r>
+      <w:proofErr w:type="spellEnd"/>
+      <w:r>
+        <w:t>.</w:t>
       </w:r>
     </w:p>
     <w:p/>
@@ -2688,6 +3919,7 @@
           <w:rFonts w:ascii="Segoe UI Emoji" w:hAnsi="Segoe UI Emoji" w:cs="Segoe UI Emoji"/>
         </w:rPr>
       </w:pPr>
+      <w:proofErr w:type="gramStart"/>
       <w:r>
         <w:rPr>
           <w:rFonts w:ascii="Segoe UI Emoji" w:hAnsi="Segoe UI Emoji" w:cs="Segoe UI Emoji"/>
@@ -2695,7 +3927,11 @@
         <w:t>🎉</w:t>
       </w:r>
       <w:r>
-        <w:t xml:space="preserve">¡Felicitaciones por la entrega del Desafío 03! </w:t>
+        <w:t>¡</w:t>
+      </w:r>
+      <w:proofErr w:type="gramEnd"/>
+      <w:r>
+        <w:t xml:space="preserve">Felicitaciones por la entrega del Desafío 03! </w:t>
       </w:r>
       <w:r>
         <w:rPr>
@@ -2713,13 +3949,53 @@
     <w:p/>
     <w:p>
       <w:r>
-        <w:t>La estructura HTML esta impecable, destaco la correcta implementación de contenedores semánticos como main, section, footer, etc. El manejo de listas, textos y títulos es correcto.</w:t>
-      </w:r>
-    </w:p>
-    <w:p/>
-    <w:p>
-      <w:r>
-        <w:t>La barra de navegación principal quedo ok, los links configurados con estado hover como se solicitó.</w:t>
+        <w:t xml:space="preserve">La estructura HTML esta impecable, destaco la correcta implementación de contenedores semánticos como </w:t>
+      </w:r>
+      <w:proofErr w:type="spellStart"/>
+      <w:r>
+        <w:t>main</w:t>
+      </w:r>
+      <w:proofErr w:type="spellEnd"/>
+      <w:r>
+        <w:t xml:space="preserve">, </w:t>
+      </w:r>
+      <w:proofErr w:type="spellStart"/>
+      <w:r>
+        <w:t>section</w:t>
+      </w:r>
+      <w:proofErr w:type="spellEnd"/>
+      <w:r>
+        <w:t xml:space="preserve">, </w:t>
+      </w:r>
+      <w:proofErr w:type="spellStart"/>
+      <w:r>
+        <w:t>footer</w:t>
+      </w:r>
+      <w:proofErr w:type="spellEnd"/>
+      <w:r>
+        <w:t>, etc. El manejo de listas, textos y títulos es correcto.</w:t>
+      </w:r>
+    </w:p>
+    <w:p/>
+    <w:p>
+      <w:r>
+        <w:t xml:space="preserve">La barra de navegación principal quedo ok, los </w:t>
+      </w:r>
+      <w:proofErr w:type="gramStart"/>
+      <w:r>
+        <w:t>links</w:t>
+      </w:r>
+      <w:proofErr w:type="gramEnd"/>
+      <w:r>
+        <w:t xml:space="preserve"> configurados con estado </w:t>
+      </w:r>
+      <w:proofErr w:type="spellStart"/>
+      <w:r>
+        <w:t>hover</w:t>
+      </w:r>
+      <w:proofErr w:type="spellEnd"/>
+      <w:r>
+        <w:t xml:space="preserve"> como se solicitó.</w:t>
       </w:r>
     </w:p>
     <w:p/>
@@ -2731,7 +4007,23 @@
     <w:p/>
     <w:p>
       <w:r>
-        <w:t>Los estilos solicitados tanto en colores, fuentes y dimensiones quedaron ok, también aplicaste correctamente las propiedades de box model. EL layout quedó responsivo como se solicitó en enunciado.</w:t>
+        <w:t xml:space="preserve">Los estilos solicitados tanto en colores, fuentes y dimensiones quedaron ok, también aplicaste correctamente las propiedades de box </w:t>
+      </w:r>
+      <w:proofErr w:type="spellStart"/>
+      <w:r>
+        <w:t>model</w:t>
+      </w:r>
+      <w:proofErr w:type="spellEnd"/>
+      <w:r>
+        <w:t xml:space="preserve">. EL </w:t>
+      </w:r>
+      <w:proofErr w:type="spellStart"/>
+      <w:r>
+        <w:t>layout</w:t>
+      </w:r>
+      <w:proofErr w:type="spellEnd"/>
+      <w:r>
+        <w:t xml:space="preserve"> quedó responsivo como se solicitó en enunciado.</w:t>
       </w:r>
     </w:p>
     <w:p/>
@@ -2771,30 +4063,41 @@
           <w:bCs/>
         </w:rPr>
       </w:pPr>
-      <w:r>
-        <w:rPr>
-          <w:rFonts w:ascii="Segoe UI Emoji" w:hAnsi="Segoe UI Emoji" w:cs="Segoe UI Emoji"/>
-          <w:b/>
-          <w:bCs/>
-        </w:rPr>
-        <w:t>Pousadas Bernardis Juan Manuel</w:t>
-      </w:r>
-    </w:p>
-    <w:p>
-      <w:pPr>
-        <w:rPr>
-          <w:rFonts w:ascii="Segoe UI Emoji" w:hAnsi="Segoe UI Emoji" w:cs="Segoe UI Emoji"/>
-          <w:b/>
-          <w:bCs/>
-        </w:rPr>
-      </w:pPr>
-    </w:p>
-    <w:p>
-      <w:pPr>
-        <w:rPr>
-          <w:rFonts w:ascii="Segoe UI Emoji" w:hAnsi="Segoe UI Emoji" w:cs="Segoe UI Emoji"/>
-        </w:rPr>
-      </w:pPr>
+      <w:proofErr w:type="spellStart"/>
+      <w:r>
+        <w:rPr>
+          <w:rFonts w:ascii="Segoe UI Emoji" w:hAnsi="Segoe UI Emoji" w:cs="Segoe UI Emoji"/>
+          <w:b/>
+          <w:bCs/>
+        </w:rPr>
+        <w:t>Pousadas</w:t>
+      </w:r>
+      <w:proofErr w:type="spellEnd"/>
+      <w:r>
+        <w:rPr>
+          <w:rFonts w:ascii="Segoe UI Emoji" w:hAnsi="Segoe UI Emoji" w:cs="Segoe UI Emoji"/>
+          <w:b/>
+          <w:bCs/>
+        </w:rPr>
+        <w:t xml:space="preserve"> Bernardis Juan Manuel</w:t>
+      </w:r>
+    </w:p>
+    <w:p>
+      <w:pPr>
+        <w:rPr>
+          <w:rFonts w:ascii="Segoe UI Emoji" w:hAnsi="Segoe UI Emoji" w:cs="Segoe UI Emoji"/>
+          <w:b/>
+          <w:bCs/>
+        </w:rPr>
+      </w:pPr>
+    </w:p>
+    <w:p>
+      <w:pPr>
+        <w:rPr>
+          <w:rFonts w:ascii="Segoe UI Emoji" w:hAnsi="Segoe UI Emoji" w:cs="Segoe UI Emoji"/>
+        </w:rPr>
+      </w:pPr>
+      <w:proofErr w:type="gramStart"/>
       <w:r>
         <w:rPr>
           <w:rFonts w:ascii="Segoe UI Emoji" w:hAnsi="Segoe UI Emoji" w:cs="Segoe UI Emoji"/>
@@ -2802,7 +4105,11 @@
         <w:t>🎉</w:t>
       </w:r>
       <w:r>
-        <w:t xml:space="preserve">¡Felicitaciones por la entrega del Desafío 08! </w:t>
+        <w:t>¡</w:t>
+      </w:r>
+      <w:proofErr w:type="gramEnd"/>
+      <w:r>
+        <w:t xml:space="preserve">Felicitaciones por la entrega del Desafío 08! </w:t>
       </w:r>
       <w:r>
         <w:rPr>
@@ -2828,7 +4135,15 @@
       </w:r>
       <w:r>
         <w:tab/>
-        <w:t>la selección de elementos del DOM y la manipulación de su contenido es correcto. También manipulaste correctamente clases y atributos con Dataset.</w:t>
+        <w:t xml:space="preserve">la selección de elementos del DOM y la manipulación de su contenido es correcto. También manipulaste correctamente clases y atributos con </w:t>
+      </w:r>
+      <w:proofErr w:type="spellStart"/>
+      <w:r>
+        <w:t>Dataset</w:t>
+      </w:r>
+      <w:proofErr w:type="spellEnd"/>
+      <w:r>
+        <w:t>.</w:t>
       </w:r>
     </w:p>
     <w:p>
@@ -2842,8 +4157,37 @@
           <w:u w:val="single"/>
         </w:rPr>
       </w:pPr>
-      <w:r>
-        <w:t>Buenisimo que aplicaste eventos con addEventListener, correcta la aplicación Event Delegation.</w:t>
+      <w:proofErr w:type="spellStart"/>
+      <w:r>
+        <w:t>Buenisimo</w:t>
+      </w:r>
+      <w:proofErr w:type="spellEnd"/>
+      <w:r>
+        <w:t xml:space="preserve"> que aplicaste eventos con </w:t>
+      </w:r>
+      <w:proofErr w:type="spellStart"/>
+      <w:r>
+        <w:t>addEventListener</w:t>
+      </w:r>
+      <w:proofErr w:type="spellEnd"/>
+      <w:r>
+        <w:t xml:space="preserve">, correcta la aplicación </w:t>
+      </w:r>
+      <w:proofErr w:type="spellStart"/>
+      <w:r>
+        <w:t>Event</w:t>
+      </w:r>
+      <w:proofErr w:type="spellEnd"/>
+      <w:r>
+        <w:t xml:space="preserve"> </w:t>
+      </w:r>
+      <w:proofErr w:type="spellStart"/>
+      <w:r>
+        <w:t>Delegation</w:t>
+      </w:r>
+      <w:proofErr w:type="spellEnd"/>
+      <w:r>
+        <w:t>.</w:t>
       </w:r>
     </w:p>
     <w:p/>
@@ -2912,6 +4256,7 @@
           <w:rFonts w:ascii="Segoe UI Emoji" w:hAnsi="Segoe UI Emoji" w:cs="Segoe UI Emoji"/>
         </w:rPr>
       </w:pPr>
+      <w:proofErr w:type="gramStart"/>
       <w:r>
         <w:rPr>
           <w:rFonts w:ascii="Segoe UI Emoji" w:hAnsi="Segoe UI Emoji" w:cs="Segoe UI Emoji"/>
@@ -2919,7 +4264,11 @@
         <w:t>🎉</w:t>
       </w:r>
       <w:r>
-        <w:t xml:space="preserve">¡Felicitaciones por la entrega del Desafío 07! </w:t>
+        <w:t>¡</w:t>
+      </w:r>
+      <w:proofErr w:type="gramEnd"/>
+      <w:r>
+        <w:t xml:space="preserve">Felicitaciones por la entrega del Desafío 07! </w:t>
       </w:r>
       <w:r>
         <w:rPr>
@@ -2937,7 +4286,31 @@
     <w:p/>
     <w:p>
       <w:r>
-        <w:t xml:space="preserve">Excelente la implementación de métodos para recorrer para arrays y objetos, diferenciaste correctamente los métodos splice y slice. </w:t>
+        <w:t xml:space="preserve">Excelente la implementación de métodos para recorrer para </w:t>
+      </w:r>
+      <w:proofErr w:type="spellStart"/>
+      <w:r>
+        <w:t>arrays</w:t>
+      </w:r>
+      <w:proofErr w:type="spellEnd"/>
+      <w:r>
+        <w:t xml:space="preserve"> y objetos, diferenciaste correctamente los métodos </w:t>
+      </w:r>
+      <w:proofErr w:type="spellStart"/>
+      <w:r>
+        <w:t>splice</w:t>
+      </w:r>
+      <w:proofErr w:type="spellEnd"/>
+      <w:r>
+        <w:t xml:space="preserve"> y </w:t>
+      </w:r>
+      <w:proofErr w:type="spellStart"/>
+      <w:r>
+        <w:t>slice</w:t>
+      </w:r>
+      <w:proofErr w:type="spellEnd"/>
+      <w:r>
+        <w:t xml:space="preserve">. </w:t>
       </w:r>
     </w:p>
     <w:p/>
@@ -2949,7 +4322,31 @@
     <w:p/>
     <w:p>
       <w:r>
-        <w:t xml:space="preserve">Buenísimo que te manejaste con template literals en lugar de concatenar strings. </w:t>
+        <w:t xml:space="preserve">Buenísimo que te manejaste con </w:t>
+      </w:r>
+      <w:proofErr w:type="spellStart"/>
+      <w:r>
+        <w:t>template</w:t>
+      </w:r>
+      <w:proofErr w:type="spellEnd"/>
+      <w:r>
+        <w:t xml:space="preserve"> </w:t>
+      </w:r>
+      <w:proofErr w:type="spellStart"/>
+      <w:r>
+        <w:t>literals</w:t>
+      </w:r>
+      <w:proofErr w:type="spellEnd"/>
+      <w:r>
+        <w:t xml:space="preserve"> en lugar de concatenar </w:t>
+      </w:r>
+      <w:proofErr w:type="spellStart"/>
+      <w:r>
+        <w:t>strings</w:t>
+      </w:r>
+      <w:proofErr w:type="spellEnd"/>
+      <w:r>
+        <w:t xml:space="preserve">. </w:t>
       </w:r>
     </w:p>
     <w:p/>
@@ -2976,7 +4373,15 @@
         </w:numPr>
       </w:pPr>
       <w:r>
-        <w:t>Me hubiera gustado que utilices al operador ternario, por ejemplo, en el ejercicio nro 5:</w:t>
+        <w:t xml:space="preserve">Me hubiera gustado que utilices al operador ternario, por ejemplo, en el ejercicio </w:t>
+      </w:r>
+      <w:proofErr w:type="spellStart"/>
+      <w:r>
+        <w:t>nro</w:t>
+      </w:r>
+      <w:proofErr w:type="spellEnd"/>
+      <w:r>
+        <w:t xml:space="preserve"> 5:</w:t>
       </w:r>
       <w:r>
         <w:tab/>
@@ -2987,16 +4392,42 @@
       <w:pPr>
         <w:ind w:left="1416"/>
       </w:pPr>
-      <w:r>
-        <w:t>const estado = promedio &gt;= 6 ? "Aprobado" : "Reprobado";</w:t>
+      <w:proofErr w:type="spellStart"/>
+      <w:r>
+        <w:t>const</w:t>
+      </w:r>
+      <w:proofErr w:type="spellEnd"/>
+      <w:r>
+        <w:t xml:space="preserve"> estado = promedio &gt;= </w:t>
+      </w:r>
+      <w:proofErr w:type="gramStart"/>
+      <w:r>
+        <w:t>6 ?</w:t>
+      </w:r>
+      <w:proofErr w:type="gramEnd"/>
+      <w:r>
+        <w:t xml:space="preserve"> "Aprobado</w:t>
+      </w:r>
+      <w:proofErr w:type="gramStart"/>
+      <w:r>
+        <w:t>" :</w:t>
+      </w:r>
+      <w:proofErr w:type="gramEnd"/>
+      <w:r>
+        <w:t xml:space="preserve"> "Reprobado";</w:t>
       </w:r>
     </w:p>
     <w:p>
       <w:pPr>
         <w:ind w:left="1416"/>
       </w:pPr>
-      <w:r>
-        <w:t>console.log(`Estado: ${estado}`);</w:t>
+      <w:proofErr w:type="gramStart"/>
+      <w:r>
+        <w:t>console.log(</w:t>
+      </w:r>
+      <w:proofErr w:type="gramEnd"/>
+      <w:r>
+        <w:t>`Estado: ${estado}`);</w:t>
       </w:r>
     </w:p>
     <w:p>

</xml_diff>